<commit_message>
Swap deploy-code and board-verification order, unify memory check
Co-authored-by: knight <lixiaohui2020@users.noreply.github.com>
</commit_message>
<xml_diff>
--- a/docs/algorithm-automation-reports/08-算法自动化工具流程修订版方案.docx
+++ b/docs/algorithm-automation-reports/08-算法自动化工具流程修订版方案.docx
@@ -59,7 +59,7 @@
           <w:rFonts w:ascii="微软雅黑" w:hAnsi="微软雅黑" w:eastAsia="微软雅黑"/>
           <w:sz w:val="21"/>
         </w:rPr>
-        <w:t xml:space="preserve"> v1.2（本版新增：复现性确认、两级测试机制、逐层比对指标、训练执行环境、release 包结构、附录 A/B/C 状态机与人工干预机制）</w:t>
+        <w:t xml:space="preserve"> v1.3（本版调整：第三部分第 5/6 节顺序对调——先部署代码编写与编译、后板端验证；内存检查从两处合并为板端验证一处统一入口，按分支 A/B 区分检查范围）</w:t>
       </w:r>
     </w:p>
     <w:p>
@@ -9989,16 +9989,21 @@
           <w:color w:val="1E40AF"/>
           <w:sz w:val="30"/>
         </w:rPr>
-        <w:t>5. 板端验证怎么做</w:t>
-      </w:r>
-    </w:p>
-    <w:p>
-      <w:r>
-        <w:rPr>
-          <w:rFonts w:ascii="微软雅黑" w:hAnsi="微软雅黑" w:eastAsia="微软雅黑"/>
-          <w:sz w:val="21"/>
-        </w:rPr>
-        <w:t>平台转换通过后，先做模型板端验证。验证包括效果测试和内存检查。</w:t>
+        <w:t>5. 部署代码编写与编译</w:t>
+      </w:r>
+    </w:p>
+    <w:p>
+      <w:pPr>
+        <w:ind w:left="400"/>
+      </w:pPr>
+      <w:r>
+        <w:rPr>
+          <w:rFonts w:ascii="微软雅黑" w:hAnsi="微软雅黑" w:eastAsia="微软雅黑"/>
+          <w:b/>
+          <w:color w:val="1E3A5F"/>
+          <w:sz w:val="21"/>
+        </w:rPr>
+        <w:t>顺序说明：平台转换产物（模型、.c/.h、加密模型等）必须先落到可运行的板端程序上，才能进行板端验证。因此本节在板端验证之前。本节只负责"产出板端可运行物"，所有板端测试（含内存检查）统一放到第 6 节板端验证执行，不在本节重复。</w:t>
       </w:r>
     </w:p>
     <w:p>
@@ -10012,57 +10017,16 @@
           <w:color w:val="334155"/>
           <w:sz w:val="26"/>
         </w:rPr>
-        <w:t>5.1 三类强制对比</w:t>
-      </w:r>
-    </w:p>
-    <w:p>
-      <w:pPr>
-        <w:pStyle w:val="ListNumber"/>
-      </w:pPr>
-      <w:r>
-        <w:rPr>
-          <w:rFonts w:ascii="微软雅黑" w:hAnsi="微软雅黑" w:eastAsia="微软雅黑"/>
-          <w:sz w:val="21"/>
-        </w:rPr>
-        <w:t>现有板端结果 vs 原板端结果</w:t>
-      </w:r>
-    </w:p>
-    <w:p>
-      <w:pPr>
-        <w:pStyle w:val="ListNumber"/>
-      </w:pPr>
-      <w:r>
-        <w:rPr>
-          <w:rFonts w:ascii="微软雅黑" w:hAnsi="微软雅黑" w:eastAsia="微软雅黑"/>
-          <w:sz w:val="21"/>
-        </w:rPr>
-        <w:t>现有板端结果 vs 基准结果</w:t>
-      </w:r>
-    </w:p>
-    <w:p>
-      <w:pPr>
-        <w:pStyle w:val="ListNumber"/>
-      </w:pPr>
-      <w:r>
-        <w:rPr>
-          <w:rFonts w:ascii="微软雅黑" w:hAnsi="微软雅黑" w:eastAsia="微软雅黑"/>
-          <w:sz w:val="21"/>
-        </w:rPr>
-        <w:t>现有板端结果 vs 仿真器结果</w:t>
-      </w:r>
-    </w:p>
-    <w:p>
-      <w:pPr>
-        <w:pStyle w:val="Heading3"/>
-      </w:pPr>
-      <w:r>
-        <w:rPr>
-          <w:rFonts w:ascii="微软雅黑" w:hAnsi="微软雅黑" w:eastAsia="微软雅黑"/>
-          <w:b/>
-          <w:color w:val="334155"/>
-          <w:sz w:val="26"/>
-        </w:rPr>
-        <w:t>5.2 测试集与两级测试机制</w:t>
+        <w:t>5.1 是否涉及代码修改（自动判断）</w:t>
+      </w:r>
+    </w:p>
+    <w:p>
+      <w:r>
+        <w:rPr>
+          <w:rFonts w:ascii="微软雅黑" w:hAnsi="微软雅黑" w:eastAsia="微软雅黑"/>
+          <w:sz w:val="21"/>
+        </w:rPr>
+        <w:t>系统根据本次任务记录判断：</w:t>
       </w:r>
     </w:p>
     <w:tbl>
@@ -10088,7 +10052,7 @@
                 <w:b/>
                 <w:sz w:val="18"/>
               </w:rPr>
-              <w:t>测试集</w:t>
+              <w:t>情况</w:t>
             </w:r>
           </w:p>
         </w:tc>
@@ -10104,7 +10068,7 @@
                 <w:b/>
                 <w:sz w:val="18"/>
               </w:rPr>
-              <w:t>作用</w:t>
+              <w:t>是否代码修改</w:t>
             </w:r>
           </w:p>
         </w:tc>
@@ -10121,7 +10085,7 @@
                 <w:rFonts w:ascii="微软雅黑" w:hAnsi="微软雅黑" w:eastAsia="微软雅黑"/>
                 <w:sz w:val="18"/>
               </w:rPr>
-              <w:t>本次 badcase 验证集</w:t>
+              <w:t>只替换模型文件</w:t>
             </w:r>
           </w:p>
         </w:tc>
@@ -10136,7 +10100,7 @@
                 <w:rFonts w:ascii="微软雅黑" w:hAnsi="微软雅黑" w:eastAsia="微软雅黑"/>
                 <w:sz w:val="18"/>
               </w:rPr>
-              <w:t>验证客户问题是否修复</w:t>
+              <w:t>否</w:t>
             </w:r>
           </w:p>
         </w:tc>
@@ -10153,7 +10117,7 @@
                 <w:rFonts w:ascii="微软雅黑" w:hAnsi="微软雅黑" w:eastAsia="微软雅黑"/>
                 <w:sz w:val="18"/>
               </w:rPr>
-              <w:t>历史问题回归集</w:t>
+              <w:t>修改阈值 / NMS 配置文件</w:t>
             </w:r>
           </w:p>
         </w:tc>
@@ -10168,7 +10132,7 @@
                 <w:rFonts w:ascii="微软雅黑" w:hAnsi="微软雅黑" w:eastAsia="微软雅黑"/>
                 <w:sz w:val="18"/>
               </w:rPr>
-              <w:t>验证过往问题是否复发</w:t>
+              <w:t>可能否，视配置管理方式</w:t>
             </w:r>
           </w:p>
         </w:tc>
@@ -10185,7 +10149,7 @@
                 <w:rFonts w:ascii="微软雅黑" w:hAnsi="微软雅黑" w:eastAsia="微软雅黑"/>
                 <w:sz w:val="18"/>
               </w:rPr>
-              <w:t>专业测试集</w:t>
+              <w:t>修改前处理 / 后处理代码</w:t>
             </w:r>
           </w:p>
         </w:tc>
@@ -10200,7 +10164,135 @@
                 <w:rFonts w:ascii="微软雅黑" w:hAnsi="微软雅黑" w:eastAsia="微软雅黑"/>
                 <w:sz w:val="18"/>
               </w:rPr>
-              <w:t>验证大盘指标是否稳定</w:t>
+              <w:t>是</w:t>
+            </w:r>
+          </w:p>
+        </w:tc>
+      </w:tr>
+      <w:tr>
+        <w:tc>
+          <w:tcPr>
+            <w:tcW w:type="dxa" w:w="4320"/>
+          </w:tcPr>
+          <w:p>
+            <w:r/>
+            <w:r>
+              <w:rPr>
+                <w:rFonts w:ascii="微软雅黑" w:hAnsi="微软雅黑" w:eastAsia="微软雅黑"/>
+                <w:sz w:val="18"/>
+              </w:rPr>
+              <w:t>V821 生成新的 .c / .h 并影响工程编译</w:t>
+            </w:r>
+          </w:p>
+        </w:tc>
+        <w:tc>
+          <w:tcPr>
+            <w:tcW w:type="dxa" w:w="4320"/>
+          </w:tcPr>
+          <w:p>
+            <w:r/>
+            <w:r>
+              <w:rPr>
+                <w:rFonts w:ascii="微软雅黑" w:hAnsi="微软雅黑" w:eastAsia="微软雅黑"/>
+                <w:sz w:val="18"/>
+              </w:rPr>
+              <w:t>是</w:t>
+            </w:r>
+          </w:p>
+        </w:tc>
+      </w:tr>
+      <w:tr>
+        <w:tc>
+          <w:tcPr>
+            <w:tcW w:type="dxa" w:w="4320"/>
+          </w:tcPr>
+          <w:p>
+            <w:r/>
+            <w:r>
+              <w:rPr>
+                <w:rFonts w:ascii="微软雅黑" w:hAnsi="微软雅黑" w:eastAsia="微软雅黑"/>
+                <w:sz w:val="18"/>
+              </w:rPr>
+              <w:t>修改 main_backend 参数读取</w:t>
+            </w:r>
+          </w:p>
+        </w:tc>
+        <w:tc>
+          <w:tcPr>
+            <w:tcW w:type="dxa" w:w="4320"/>
+          </w:tcPr>
+          <w:p>
+            <w:r/>
+            <w:r>
+              <w:rPr>
+                <w:rFonts w:ascii="微软雅黑" w:hAnsi="微软雅黑" w:eastAsia="微软雅黑"/>
+                <w:sz w:val="18"/>
+              </w:rPr>
+              <w:t>是</w:t>
+            </w:r>
+          </w:p>
+        </w:tc>
+      </w:tr>
+      <w:tr>
+        <w:tc>
+          <w:tcPr>
+            <w:tcW w:type="dxa" w:w="4320"/>
+          </w:tcPr>
+          <w:p>
+            <w:r/>
+            <w:r>
+              <w:rPr>
+                <w:rFonts w:ascii="微软雅黑" w:hAnsi="微软雅黑" w:eastAsia="微软雅黑"/>
+                <w:sz w:val="18"/>
+              </w:rPr>
+              <w:t>修改板端推理流程</w:t>
+            </w:r>
+          </w:p>
+        </w:tc>
+        <w:tc>
+          <w:tcPr>
+            <w:tcW w:type="dxa" w:w="4320"/>
+          </w:tcPr>
+          <w:p>
+            <w:r/>
+            <w:r>
+              <w:rPr>
+                <w:rFonts w:ascii="微软雅黑" w:hAnsi="微软雅黑" w:eastAsia="微软雅黑"/>
+                <w:sz w:val="18"/>
+              </w:rPr>
+              <w:t>是</w:t>
+            </w:r>
+          </w:p>
+        </w:tc>
+      </w:tr>
+      <w:tr>
+        <w:tc>
+          <w:tcPr>
+            <w:tcW w:type="dxa" w:w="4320"/>
+          </w:tcPr>
+          <w:p>
+            <w:r/>
+            <w:r>
+              <w:rPr>
+                <w:rFonts w:ascii="微软雅黑" w:hAnsi="微软雅黑" w:eastAsia="微软雅黑"/>
+                <w:sz w:val="18"/>
+              </w:rPr>
+              <w:t>修改 SDK / runtime 配置</w:t>
+            </w:r>
+          </w:p>
+        </w:tc>
+        <w:tc>
+          <w:tcPr>
+            <w:tcW w:type="dxa" w:w="4320"/>
+          </w:tcPr>
+          <w:p>
+            <w:r/>
+            <w:r>
+              <w:rPr>
+                <w:rFonts w:ascii="微软雅黑" w:hAnsi="微软雅黑" w:eastAsia="微软雅黑"/>
+                <w:sz w:val="18"/>
+              </w:rPr>
+              <w:t>是</w:t>
             </w:r>
           </w:p>
         </w:tc>
@@ -10208,67 +10300,6 @@
     </w:tbl>
     <w:p/>
     <w:p>
-      <w:r>
-        <w:rPr>
-          <w:rFonts w:ascii="微软雅黑" w:hAnsi="微软雅黑" w:eastAsia="微软雅黑"/>
-          <w:sz w:val="21"/>
-        </w:rPr>
-        <w:t>板端跑测耗时较长时，采用两级机制：</w:t>
-      </w:r>
-    </w:p>
-    <w:p>
-      <w:pPr>
-        <w:pStyle w:val="ListBullet"/>
-      </w:pPr>
-      <w:r>
-        <w:rPr>
-          <w:rFonts w:ascii="微软雅黑" w:hAnsi="微软雅黑" w:eastAsia="微软雅黑"/>
-          <w:sz w:val="21"/>
-        </w:rPr>
-      </w:r>
-      <w:r>
-        <w:rPr>
-          <w:rFonts w:ascii="微软雅黑" w:hAnsi="微软雅黑" w:eastAsia="微软雅黑"/>
-          <w:b/>
-          <w:sz w:val="21"/>
-        </w:rPr>
-        <w:t>快速门禁集</w:t>
-      </w:r>
-      <w:r>
-        <w:rPr>
-          <w:rFonts w:ascii="微软雅黑" w:hAnsi="微软雅黑" w:eastAsia="微软雅黑"/>
-          <w:sz w:val="21"/>
-        </w:rPr>
-        <w:t>（每次必跑）：本次 badcase + 小规模历史核心集，快速淘汰明显不合格版本</w:t>
-      </w:r>
-    </w:p>
-    <w:p>
-      <w:pPr>
-        <w:pStyle w:val="ListBullet"/>
-      </w:pPr>
-      <w:r>
-        <w:rPr>
-          <w:rFonts w:ascii="微软雅黑" w:hAnsi="微软雅黑" w:eastAsia="微软雅黑"/>
-          <w:sz w:val="21"/>
-        </w:rPr>
-      </w:r>
-      <w:r>
-        <w:rPr>
-          <w:rFonts w:ascii="微软雅黑" w:hAnsi="微软雅黑" w:eastAsia="微软雅黑"/>
-          <w:b/>
-          <w:sz w:val="21"/>
-        </w:rPr>
-        <w:t>完整回归集</w:t>
-      </w:r>
-      <w:r>
-        <w:rPr>
-          <w:rFonts w:ascii="微软雅黑" w:hAnsi="微软雅黑" w:eastAsia="微软雅黑"/>
-          <w:sz w:val="21"/>
-        </w:rPr>
-        <w:t>（快速门禁通过后跑）：专业测试集 + 全量历史问题集 + 性能/长稳测试</w:t>
-      </w:r>
-    </w:p>
-    <w:p>
       <w:pPr>
         <w:pStyle w:val="Heading3"/>
       </w:pPr>
@@ -10279,130 +10310,81 @@
           <w:color w:val="334155"/>
           <w:sz w:val="26"/>
         </w:rPr>
-        <w:t>5.3 达标标准（建议在进入转换前就写进任务单）</w:t>
-      </w:r>
-    </w:p>
-    <w:p>
-      <w:r>
-        <w:rPr>
-          <w:rFonts w:ascii="微软雅黑" w:hAnsi="微软雅黑" w:eastAsia="微软雅黑"/>
-          <w:sz w:val="21"/>
-        </w:rPr>
-        <w:t>客户问题修复标准：</w:t>
-      </w:r>
-    </w:p>
-    <w:p>
-      <w:pPr>
-        <w:pStyle w:val="ListBullet"/>
-      </w:pPr>
-      <w:r>
-        <w:rPr>
-          <w:rFonts w:ascii="微软雅黑" w:hAnsi="微软雅黑" w:eastAsia="微软雅黑"/>
-          <w:sz w:val="21"/>
-        </w:rPr>
-        <w:t>本次 badcase：FP 消除率 ≥ 80%，FN 召回率 ≥ 80%</w:t>
-      </w:r>
-    </w:p>
-    <w:p>
-      <w:pPr>
-        <w:pStyle w:val="ListBullet"/>
-      </w:pPr>
-      <w:r>
-        <w:rPr>
-          <w:rFonts w:ascii="微软雅黑" w:hAnsi="微软雅黑" w:eastAsia="微软雅黑"/>
-          <w:sz w:val="21"/>
-        </w:rPr>
-        <w:t>关键客户指定 case 必须 100% 通过</w:t>
-      </w:r>
-    </w:p>
-    <w:p>
-      <w:r>
-        <w:rPr>
-          <w:rFonts w:ascii="微软雅黑" w:hAnsi="微软雅黑" w:eastAsia="微软雅黑"/>
-          <w:sz w:val="21"/>
-        </w:rPr>
-        <w:t>历史回归标准：</w:t>
-      </w:r>
-    </w:p>
-    <w:p>
-      <w:pPr>
-        <w:pStyle w:val="ListBullet"/>
-      </w:pPr>
-      <w:r>
-        <w:rPr>
-          <w:rFonts w:ascii="微软雅黑" w:hAnsi="微软雅黑" w:eastAsia="微软雅黑"/>
-          <w:sz w:val="21"/>
-        </w:rPr>
-        <w:t>历史问题集不得新增严重 FP/FN</w:t>
-      </w:r>
-    </w:p>
-    <w:p>
-      <w:pPr>
-        <w:pStyle w:val="ListBullet"/>
-      </w:pPr>
-      <w:r>
-        <w:rPr>
-          <w:rFonts w:ascii="微软雅黑" w:hAnsi="微软雅黑" w:eastAsia="微软雅黑"/>
-          <w:sz w:val="21"/>
-        </w:rPr>
-        <w:t>关键历史 case 通过率 100%</w:t>
-      </w:r>
-    </w:p>
-    <w:p>
-      <w:r>
-        <w:rPr>
-          <w:rFonts w:ascii="微软雅黑" w:hAnsi="微软雅黑" w:eastAsia="微软雅黑"/>
-          <w:sz w:val="21"/>
-        </w:rPr>
-        <w:t>板端性能标准：</w:t>
-      </w:r>
-    </w:p>
-    <w:p>
-      <w:pPr>
-        <w:pStyle w:val="ListBullet"/>
-      </w:pPr>
-      <w:r>
-        <w:rPr>
-          <w:rFonts w:ascii="微软雅黑" w:hAnsi="微软雅黑" w:eastAsia="微软雅黑"/>
-          <w:sz w:val="21"/>
-        </w:rPr>
-        <w:t>帧率不低于要求</w:t>
-      </w:r>
-    </w:p>
-    <w:p>
-      <w:pPr>
-        <w:pStyle w:val="ListBullet"/>
-      </w:pPr>
-      <w:r>
-        <w:rPr>
-          <w:rFonts w:ascii="微软雅黑" w:hAnsi="微软雅黑" w:eastAsia="微软雅黑"/>
-          <w:sz w:val="21"/>
-        </w:rPr>
-        <w:t>内存不超过限制</w:t>
-      </w:r>
-    </w:p>
-    <w:p>
-      <w:pPr>
-        <w:pStyle w:val="ListBullet"/>
-      </w:pPr>
-      <w:r>
-        <w:rPr>
-          <w:rFonts w:ascii="微软雅黑" w:hAnsi="微软雅黑" w:eastAsia="微软雅黑"/>
-          <w:sz w:val="21"/>
-        </w:rPr>
-        <w:t>模型加载正常</w:t>
-      </w:r>
-    </w:p>
-    <w:p>
-      <w:pPr>
-        <w:pStyle w:val="ListBullet"/>
-      </w:pPr>
-      <w:r>
-        <w:rPr>
-          <w:rFonts w:ascii="微软雅黑" w:hAnsi="微软雅黑" w:eastAsia="微软雅黑"/>
-          <w:sz w:val="21"/>
-        </w:rPr>
-        <w:t>长时间运行无异常</w:t>
+        <w:t>5.2 分支 A：只更新模型，不改代码</w:t>
+      </w:r>
+    </w:p>
+    <w:p>
+      <w:r>
+        <w:rPr>
+          <w:rFonts w:ascii="微软雅黑" w:hAnsi="微软雅黑" w:eastAsia="微软雅黑"/>
+          <w:sz w:val="21"/>
+        </w:rPr>
+        <w:t>无需编译，自动完成部署准备：</w:t>
+      </w:r>
+    </w:p>
+    <w:p>
+      <w:pPr>
+        <w:spacing w:after="0" w:before="0"/>
+        <w:ind w:left="320"/>
+      </w:pPr>
+      <w:r>
+        <w:rPr>
+          <w:rFonts w:ascii="Consolas" w:hAnsi="Consolas" w:eastAsia="微软雅黑"/>
+          <w:color w:val="1F2937"/>
+          <w:sz w:val="18"/>
+        </w:rPr>
+        <w:t>取平台转换产物（模型/配置）</w:t>
+      </w:r>
+    </w:p>
+    <w:p>
+      <w:pPr>
+        <w:spacing w:after="0" w:before="0"/>
+        <w:ind w:left="320"/>
+      </w:pPr>
+      <w:r>
+        <w:rPr>
+          <w:rFonts w:ascii="Consolas" w:hAnsi="Consolas" w:eastAsia="微软雅黑"/>
+          <w:color w:val="1F2937"/>
+          <w:sz w:val="18"/>
+        </w:rPr>
+        <w:t xml:space="preserve">  → 按平台部署规范放置模型与配置文件</w:t>
+      </w:r>
+    </w:p>
+    <w:p>
+      <w:pPr>
+        <w:spacing w:after="0" w:before="0"/>
+        <w:ind w:left="320"/>
+      </w:pPr>
+      <w:r>
+        <w:rPr>
+          <w:rFonts w:ascii="Consolas" w:hAnsi="Consolas" w:eastAsia="微软雅黑"/>
+          <w:color w:val="1F2937"/>
+          <w:sz w:val="18"/>
+        </w:rPr>
+        <w:t xml:space="preserve">  → 记录模型版本、配置版本</w:t>
+      </w:r>
+    </w:p>
+    <w:p>
+      <w:pPr>
+        <w:spacing w:after="0" w:before="0"/>
+        <w:ind w:left="320"/>
+      </w:pPr>
+      <w:r>
+        <w:rPr>
+          <w:rFonts w:ascii="Consolas" w:hAnsi="Consolas" w:eastAsia="微软雅黑"/>
+          <w:color w:val="1F2937"/>
+          <w:sz w:val="18"/>
+        </w:rPr>
+        <w:t xml:space="preserve">  → 直接进入第 6 节板端验证</w:t>
+      </w:r>
+    </w:p>
+    <w:p>
+      <w:r>
+        <w:rPr>
+          <w:rFonts w:ascii="微软雅黑" w:hAnsi="微软雅黑" w:eastAsia="微软雅黑"/>
+          <w:sz w:val="21"/>
+        </w:rPr>
+        <w:t>说明：分支 A 使用板端现有可执行程序，只换模型和配置；交付物收集与审批在第四部分交付环节统一做，本节不重复。</w:t>
       </w:r>
     </w:p>
     <w:p>
@@ -10416,7 +10398,538 @@
           <w:color w:val="334155"/>
           <w:sz w:val="26"/>
         </w:rPr>
-        <w:t>5.4 内存检查</w:t>
+        <w:t>5.3 分支 B：涉及代码修改</w:t>
+      </w:r>
+    </w:p>
+    <w:p>
+      <w:pPr>
+        <w:pStyle w:val="Heading4"/>
+      </w:pPr>
+      <w:r>
+        <w:rPr>
+          <w:rFonts w:ascii="微软雅黑" w:hAnsi="微软雅黑" w:eastAsia="微软雅黑"/>
+          <w:b/>
+          <w:color w:val="475569"/>
+          <w:sz w:val="24"/>
+        </w:rPr>
+        <w:t>Step B1：代码整理</w:t>
+      </w:r>
+    </w:p>
+    <w:p>
+      <w:r>
+        <w:rPr>
+          <w:rFonts w:ascii="微软雅黑" w:hAnsi="微软雅黑" w:eastAsia="微软雅黑"/>
+          <w:sz w:val="21"/>
+        </w:rPr>
+        <w:t>自动辅助检查：</w:t>
+      </w:r>
+    </w:p>
+    <w:p>
+      <w:pPr>
+        <w:pStyle w:val="ListBullet"/>
+      </w:pPr>
+      <w:r>
+        <w:rPr>
+          <w:rFonts w:ascii="微软雅黑" w:hAnsi="微软雅黑" w:eastAsia="微软雅黑"/>
+          <w:sz w:val="21"/>
+        </w:rPr>
+        <w:t>代码格式化</w:t>
+      </w:r>
+    </w:p>
+    <w:p>
+      <w:pPr>
+        <w:pStyle w:val="ListBullet"/>
+      </w:pPr>
+      <w:r>
+        <w:rPr>
+          <w:rFonts w:ascii="微软雅黑" w:hAnsi="微软雅黑" w:eastAsia="微软雅黑"/>
+          <w:sz w:val="21"/>
+        </w:rPr>
+        <w:t>无调试日志残留</w:t>
+      </w:r>
+    </w:p>
+    <w:p>
+      <w:pPr>
+        <w:pStyle w:val="ListBullet"/>
+      </w:pPr>
+      <w:r>
+        <w:rPr>
+          <w:rFonts w:ascii="微软雅黑" w:hAnsi="微软雅黑" w:eastAsia="微软雅黑"/>
+          <w:sz w:val="21"/>
+        </w:rPr>
+        <w:t>无硬编码临时路径</w:t>
+      </w:r>
+    </w:p>
+    <w:p>
+      <w:pPr>
+        <w:pStyle w:val="ListBullet"/>
+      </w:pPr>
+      <w:r>
+        <w:rPr>
+          <w:rFonts w:ascii="微软雅黑" w:hAnsi="微软雅黑" w:eastAsia="微软雅黑"/>
+          <w:sz w:val="21"/>
+        </w:rPr>
+        <w:t>无测试开关残留</w:t>
+      </w:r>
+    </w:p>
+    <w:p>
+      <w:pPr>
+        <w:pStyle w:val="ListBullet"/>
+      </w:pPr>
+      <w:r>
+        <w:rPr>
+          <w:rFonts w:ascii="微软雅黑" w:hAnsi="微软雅黑" w:eastAsia="微软雅黑"/>
+          <w:sz w:val="21"/>
+        </w:rPr>
+        <w:t>配置项有默认值</w:t>
+      </w:r>
+    </w:p>
+    <w:p>
+      <w:pPr>
+        <w:pStyle w:val="ListBullet"/>
+      </w:pPr>
+      <w:r>
+        <w:rPr>
+          <w:rFonts w:ascii="微软雅黑" w:hAnsi="微软雅黑" w:eastAsia="微软雅黑"/>
+          <w:sz w:val="21"/>
+        </w:rPr>
+        <w:t>错误处理完整</w:t>
+      </w:r>
+    </w:p>
+    <w:p>
+      <w:pPr>
+        <w:pStyle w:val="ListBullet"/>
+      </w:pPr>
+      <w:r>
+        <w:rPr>
+          <w:rFonts w:ascii="微软雅黑" w:hAnsi="微软雅黑" w:eastAsia="微软雅黑"/>
+          <w:sz w:val="21"/>
+        </w:rPr>
+        <w:t>与模型版本/参数版本一致</w:t>
+      </w:r>
+    </w:p>
+    <w:p>
+      <w:r>
+        <w:rPr>
+          <w:rFonts w:ascii="微软雅黑" w:hAnsi="微软雅黑" w:eastAsia="微软雅黑"/>
+          <w:sz w:val="21"/>
+        </w:rPr>
+        <w:t>人工检查：</w:t>
+      </w:r>
+    </w:p>
+    <w:p>
+      <w:pPr>
+        <w:pStyle w:val="ListBullet"/>
+      </w:pPr>
+      <w:r>
+        <w:rPr>
+          <w:rFonts w:ascii="微软雅黑" w:hAnsi="微软雅黑" w:eastAsia="微软雅黑"/>
+          <w:sz w:val="21"/>
+        </w:rPr>
+        <w:t>代码逻辑是否正确</w:t>
+      </w:r>
+    </w:p>
+    <w:p>
+      <w:pPr>
+        <w:pStyle w:val="ListBullet"/>
+      </w:pPr>
+      <w:r>
+        <w:rPr>
+          <w:rFonts w:ascii="微软雅黑" w:hAnsi="微软雅黑" w:eastAsia="微软雅黑"/>
+          <w:sz w:val="21"/>
+        </w:rPr>
+        <w:t>main_backend 参数是否匹配</w:t>
+      </w:r>
+    </w:p>
+    <w:p>
+      <w:pPr>
+        <w:pStyle w:val="ListBullet"/>
+      </w:pPr>
+      <w:r>
+        <w:rPr>
+          <w:rFonts w:ascii="微软雅黑" w:hAnsi="微软雅黑" w:eastAsia="微软雅黑"/>
+          <w:sz w:val="21"/>
+        </w:rPr>
+        <w:t>前后处理逻辑是否与训练/转换配置一致</w:t>
+      </w:r>
+    </w:p>
+    <w:p>
+      <w:pPr>
+        <w:pStyle w:val="Heading4"/>
+      </w:pPr>
+      <w:r>
+        <w:rPr>
+          <w:rFonts w:ascii="微软雅黑" w:hAnsi="微软雅黑" w:eastAsia="微软雅黑"/>
+          <w:b/>
+          <w:color w:val="475569"/>
+          <w:sz w:val="24"/>
+        </w:rPr>
+        <w:t>Step B2：编译</w:t>
+      </w:r>
+    </w:p>
+    <w:p>
+      <w:r>
+        <w:rPr>
+          <w:rFonts w:ascii="微软雅黑" w:hAnsi="微软雅黑" w:eastAsia="微软雅黑"/>
+          <w:sz w:val="21"/>
+        </w:rPr>
+        <w:t>自动执行：</w:t>
+      </w:r>
+    </w:p>
+    <w:p>
+      <w:pPr>
+        <w:spacing w:after="0" w:before="0"/>
+        <w:ind w:left="320"/>
+      </w:pPr>
+      <w:r>
+        <w:rPr>
+          <w:rFonts w:ascii="Consolas" w:hAnsi="Consolas" w:eastAsia="微软雅黑"/>
+          <w:color w:val="1F2937"/>
+          <w:sz w:val="18"/>
+        </w:rPr>
+        <w:t>拉取指定代码分支</w:t>
+      </w:r>
+    </w:p>
+    <w:p>
+      <w:pPr>
+        <w:spacing w:after="0" w:before="0"/>
+        <w:ind w:left="320"/>
+      </w:pPr>
+      <w:r>
+        <w:rPr>
+          <w:rFonts w:ascii="Consolas" w:hAnsi="Consolas" w:eastAsia="微软雅黑"/>
+          <w:color w:val="1F2937"/>
+          <w:sz w:val="18"/>
+        </w:rPr>
+        <w:t xml:space="preserve">  ↓</w:t>
+      </w:r>
+    </w:p>
+    <w:p>
+      <w:pPr>
+        <w:spacing w:after="0" w:before="0"/>
+        <w:ind w:left="320"/>
+      </w:pPr>
+      <w:r>
+        <w:rPr>
+          <w:rFonts w:ascii="Consolas" w:hAnsi="Consolas" w:eastAsia="微软雅黑"/>
+          <w:color w:val="1F2937"/>
+          <w:sz w:val="18"/>
+        </w:rPr>
+        <w:t>应用本次修改</w:t>
+      </w:r>
+    </w:p>
+    <w:p>
+      <w:pPr>
+        <w:spacing w:after="0" w:before="0"/>
+        <w:ind w:left="320"/>
+      </w:pPr>
+      <w:r>
+        <w:rPr>
+          <w:rFonts w:ascii="Consolas" w:hAnsi="Consolas" w:eastAsia="微软雅黑"/>
+          <w:color w:val="1F2937"/>
+          <w:sz w:val="18"/>
+        </w:rPr>
+        <w:t xml:space="preserve">  ↓</w:t>
+      </w:r>
+    </w:p>
+    <w:p>
+      <w:pPr>
+        <w:spacing w:after="0" w:before="0"/>
+        <w:ind w:left="320"/>
+      </w:pPr>
+      <w:r>
+        <w:rPr>
+          <w:rFonts w:ascii="Consolas" w:hAnsi="Consolas" w:eastAsia="微软雅黑"/>
+          <w:color w:val="1F2937"/>
+          <w:sz w:val="18"/>
+        </w:rPr>
+        <w:t>编译</w:t>
+      </w:r>
+    </w:p>
+    <w:p>
+      <w:pPr>
+        <w:spacing w:after="0" w:before="0"/>
+        <w:ind w:left="320"/>
+      </w:pPr>
+      <w:r>
+        <w:rPr>
+          <w:rFonts w:ascii="Consolas" w:hAnsi="Consolas" w:eastAsia="微软雅黑"/>
+          <w:color w:val="1F2937"/>
+          <w:sz w:val="18"/>
+        </w:rPr>
+        <w:t xml:space="preserve">  ↓</w:t>
+      </w:r>
+    </w:p>
+    <w:p>
+      <w:pPr>
+        <w:spacing w:after="0" w:before="0"/>
+        <w:ind w:left="320"/>
+      </w:pPr>
+      <w:r>
+        <w:rPr>
+          <w:rFonts w:ascii="Consolas" w:hAnsi="Consolas" w:eastAsia="微软雅黑"/>
+          <w:color w:val="1F2937"/>
+          <w:sz w:val="18"/>
+        </w:rPr>
+        <w:t>生成可执行文件 / so / 固件组件</w:t>
+      </w:r>
+    </w:p>
+    <w:p>
+      <w:pPr>
+        <w:spacing w:after="0" w:before="0"/>
+        <w:ind w:left="320"/>
+      </w:pPr>
+      <w:r>
+        <w:rPr>
+          <w:rFonts w:ascii="Consolas" w:hAnsi="Consolas" w:eastAsia="微软雅黑"/>
+          <w:color w:val="1F2937"/>
+          <w:sz w:val="18"/>
+        </w:rPr>
+        <w:t xml:space="preserve">  ↓</w:t>
+      </w:r>
+    </w:p>
+    <w:p>
+      <w:pPr>
+        <w:spacing w:after="0" w:before="0"/>
+        <w:ind w:left="320"/>
+      </w:pPr>
+      <w:r>
+        <w:rPr>
+          <w:rFonts w:ascii="Consolas" w:hAnsi="Consolas" w:eastAsia="微软雅黑"/>
+          <w:color w:val="1F2937"/>
+          <w:sz w:val="18"/>
+        </w:rPr>
+        <w:t>记录编译日志、代码 commit、产物版本</w:t>
+      </w:r>
+    </w:p>
+    <w:p>
+      <w:r>
+        <w:rPr>
+          <w:rFonts w:ascii="微软雅黑" w:hAnsi="微软雅黑" w:eastAsia="微软雅黑"/>
+          <w:sz w:val="21"/>
+        </w:rPr>
+        <w:t>失败时：</w:t>
+      </w:r>
+    </w:p>
+    <w:p>
+      <w:pPr>
+        <w:spacing w:after="0" w:before="0"/>
+        <w:ind w:left="320"/>
+      </w:pPr>
+      <w:r>
+        <w:rPr>
+          <w:rFonts w:ascii="Consolas" w:hAnsi="Consolas" w:eastAsia="微软雅黑"/>
+          <w:color w:val="1F2937"/>
+          <w:sz w:val="18"/>
+        </w:rPr>
+        <w:t>编译失败 → 自动归类错误 → 派给软件负责人 → 修复后重新编译</w:t>
+      </w:r>
+    </w:p>
+    <w:p>
+      <w:pPr>
+        <w:pStyle w:val="Heading4"/>
+      </w:pPr>
+      <w:r>
+        <w:rPr>
+          <w:rFonts w:ascii="微软雅黑" w:hAnsi="微软雅黑" w:eastAsia="微软雅黑"/>
+          <w:b/>
+          <w:color w:val="475569"/>
+          <w:sz w:val="24"/>
+        </w:rPr>
+        <w:t>Step B3：部署到板端</w:t>
+      </w:r>
+    </w:p>
+    <w:p>
+      <w:r>
+        <w:rPr>
+          <w:rFonts w:ascii="微软雅黑" w:hAnsi="微软雅黑" w:eastAsia="微软雅黑"/>
+          <w:sz w:val="21"/>
+        </w:rPr>
+        <w:t>编译通过后，自动将可执行程序 + 模型 + 配置部署到对应平台板子，进入第 6 节板端验证。</w:t>
+      </w:r>
+    </w:p>
+    <w:p>
+      <w:pPr>
+        <w:pStyle w:val="Heading3"/>
+      </w:pPr>
+      <w:r>
+        <w:rPr>
+          <w:rFonts w:ascii="微软雅黑" w:hAnsi="微软雅黑" w:eastAsia="微软雅黑"/>
+          <w:b/>
+          <w:color w:val="334155"/>
+          <w:sz w:val="26"/>
+        </w:rPr>
+        <w:t>5.4 本节输出物</w:t>
+      </w:r>
+    </w:p>
+    <w:tbl>
+      <w:tblPr>
+        <w:tblStyle w:val="TableGrid"/>
+        <w:tblW w:type="auto" w:w="0"/>
+        <w:tblLook w:firstColumn="1" w:firstRow="1" w:lastColumn="0" w:lastRow="0" w:noHBand="0" w:noVBand="1" w:val="04A0"/>
+      </w:tblPr>
+      <w:tblGrid>
+        <w:gridCol w:w="4320"/>
+        <w:gridCol w:w="4320"/>
+      </w:tblGrid>
+      <w:tr>
+        <w:tc>
+          <w:tcPr>
+            <w:tcW w:type="dxa" w:w="4320"/>
+          </w:tcPr>
+          <w:p>
+            <w:r/>
+            <w:r>
+              <w:rPr>
+                <w:rFonts w:ascii="微软雅黑" w:hAnsi="微软雅黑" w:eastAsia="微软雅黑"/>
+                <w:b/>
+                <w:sz w:val="18"/>
+              </w:rPr>
+              <w:t>分支</w:t>
+            </w:r>
+          </w:p>
+        </w:tc>
+        <w:tc>
+          <w:tcPr>
+            <w:tcW w:type="dxa" w:w="4320"/>
+          </w:tcPr>
+          <w:p>
+            <w:r/>
+            <w:r>
+              <w:rPr>
+                <w:rFonts w:ascii="微软雅黑" w:hAnsi="微软雅黑" w:eastAsia="微软雅黑"/>
+                <w:b/>
+                <w:sz w:val="18"/>
+              </w:rPr>
+              <w:t>输出</w:t>
+            </w:r>
+          </w:p>
+        </w:tc>
+      </w:tr>
+      <w:tr>
+        <w:tc>
+          <w:tcPr>
+            <w:tcW w:type="dxa" w:w="4320"/>
+          </w:tcPr>
+          <w:p>
+            <w:r/>
+            <w:r>
+              <w:rPr>
+                <w:rFonts w:ascii="微软雅黑" w:hAnsi="微软雅黑" w:eastAsia="微软雅黑"/>
+                <w:sz w:val="18"/>
+              </w:rPr>
+              <w:t>A 只换模型</w:t>
+            </w:r>
+          </w:p>
+        </w:tc>
+        <w:tc>
+          <w:tcPr>
+            <w:tcW w:type="dxa" w:w="4320"/>
+          </w:tcPr>
+          <w:p>
+            <w:r/>
+            <w:r>
+              <w:rPr>
+                <w:rFonts w:ascii="微软雅黑" w:hAnsi="微软雅黑" w:eastAsia="微软雅黑"/>
+                <w:sz w:val="18"/>
+              </w:rPr>
+              <w:t>板端就绪的模型 + 配置（沿用旧程序）</w:t>
+            </w:r>
+          </w:p>
+        </w:tc>
+      </w:tr>
+      <w:tr>
+        <w:tc>
+          <w:tcPr>
+            <w:tcW w:type="dxa" w:w="4320"/>
+          </w:tcPr>
+          <w:p>
+            <w:r/>
+            <w:r>
+              <w:rPr>
+                <w:rFonts w:ascii="微软雅黑" w:hAnsi="微软雅黑" w:eastAsia="微软雅黑"/>
+                <w:sz w:val="18"/>
+              </w:rPr>
+              <w:t>B 改代码</w:t>
+            </w:r>
+          </w:p>
+        </w:tc>
+        <w:tc>
+          <w:tcPr>
+            <w:tcW w:type="dxa" w:w="4320"/>
+          </w:tcPr>
+          <w:p>
+            <w:r/>
+            <w:r>
+              <w:rPr>
+                <w:rFonts w:ascii="微软雅黑" w:hAnsi="微软雅黑" w:eastAsia="微软雅黑"/>
+                <w:sz w:val="18"/>
+              </w:rPr>
+              <w:t>新可执行程序 + 模型 + 配置 + 编译日志</w:t>
+            </w:r>
+          </w:p>
+        </w:tc>
+      </w:tr>
+    </w:tbl>
+    <w:p/>
+    <w:p>
+      <w:r>
+        <w:rPr>
+          <w:rFonts w:ascii="微软雅黑" w:hAnsi="微软雅黑" w:eastAsia="微软雅黑"/>
+          <w:sz w:val="21"/>
+        </w:rPr>
+        <w:t>两个分支的输出都汇入同一个板端验证入口，验证标准一致。</w:t>
+      </w:r>
+    </w:p>
+    <w:p>
+      <w:pPr>
+        <w:pStyle w:val="Heading2"/>
+      </w:pPr>
+      <w:r>
+        <w:rPr>
+          <w:rFonts w:ascii="微软雅黑" w:hAnsi="微软雅黑" w:eastAsia="微软雅黑"/>
+          <w:b/>
+          <w:color w:val="1E40AF"/>
+          <w:sz w:val="30"/>
+        </w:rPr>
+        <w:t>6. 板端验证（含内存检查，统一入口）</w:t>
+      </w:r>
+    </w:p>
+    <w:p>
+      <w:r>
+        <w:rPr>
+          <w:rFonts w:ascii="微软雅黑" w:hAnsi="微软雅黑" w:eastAsia="微软雅黑"/>
+          <w:sz w:val="21"/>
+        </w:rPr>
+        <w:t>部署完成后统一执行板端验证。</w:t>
+      </w:r>
+      <w:r>
+        <w:rPr>
+          <w:rFonts w:ascii="微软雅黑" w:hAnsi="微软雅黑" w:eastAsia="微软雅黑"/>
+          <w:b/>
+          <w:sz w:val="21"/>
+        </w:rPr>
+        <w:t>无论分支 A 还是分支 B，都走本节；内存检查只在本节做，全流程仅此一处。</w:t>
+      </w:r>
+      <w:r>
+        <w:rPr>
+          <w:rFonts w:ascii="微软雅黑" w:hAnsi="微软雅黑" w:eastAsia="微软雅黑"/>
+          <w:sz w:val="21"/>
+        </w:rPr>
+      </w:r>
+    </w:p>
+    <w:p>
+      <w:pPr>
+        <w:pStyle w:val="Heading3"/>
+      </w:pPr>
+      <w:r>
+        <w:rPr>
+          <w:rFonts w:ascii="微软雅黑" w:hAnsi="微软雅黑" w:eastAsia="微软雅黑"/>
+          <w:b/>
+          <w:color w:val="334155"/>
+          <w:sz w:val="26"/>
+        </w:rPr>
+        <w:t>6.1 验证范围按分支区分</w:t>
       </w:r>
     </w:p>
     <w:tbl>
@@ -10443,7 +10956,7 @@
                 <w:b/>
                 <w:sz w:val="18"/>
               </w:rPr>
-              <w:t>检查项</w:t>
+              <w:t>分支</w:t>
             </w:r>
           </w:p>
         </w:tc>
@@ -10459,7 +10972,7 @@
                 <w:b/>
                 <w:sz w:val="18"/>
               </w:rPr>
-              <w:t>目的</w:t>
+              <w:t>效果测试</w:t>
             </w:r>
           </w:p>
         </w:tc>
@@ -10475,7 +10988,7 @@
                 <w:b/>
                 <w:sz w:val="18"/>
               </w:rPr>
-              <w:t>自动化程度</w:t>
+              <w:t>内存检查</w:t>
             </w:r>
           </w:p>
         </w:tc>
@@ -10492,7 +11005,7 @@
                 <w:rFonts w:ascii="微软雅黑" w:hAnsi="微软雅黑" w:eastAsia="微软雅黑"/>
                 <w:sz w:val="18"/>
               </w:rPr>
-              <w:t>模型加载内存峰值</w:t>
+              <w:t>A 只换模型</w:t>
             </w:r>
           </w:p>
         </w:tc>
@@ -10507,7 +11020,7 @@
                 <w:rFonts w:ascii="微软雅黑" w:hAnsi="微软雅黑" w:eastAsia="微软雅黑"/>
                 <w:sz w:val="18"/>
               </w:rPr>
-              <w:t>防止超出板端限制</w:t>
+              <w:t>全量（三类对比 + 三层测试集）</w:t>
             </w:r>
           </w:p>
         </w:tc>
@@ -10522,7 +11035,7 @@
                 <w:rFonts w:ascii="微软雅黑" w:hAnsi="微软雅黑" w:eastAsia="微软雅黑"/>
                 <w:sz w:val="18"/>
               </w:rPr>
-              <w:t>高</w:t>
+              <w:t>基础项（加载峰值、循环推理增长、释放回落）——模型变化也可能改变内存占用</w:t>
             </w:r>
           </w:p>
         </w:tc>
@@ -10539,7 +11052,7 @@
                 <w:rFonts w:ascii="微软雅黑" w:hAnsi="微软雅黑" w:eastAsia="微软雅黑"/>
                 <w:sz w:val="18"/>
               </w:rPr>
-              <w:t>推理过程中内存增长</w:t>
+              <w:t>B 改代码</w:t>
             </w:r>
           </w:p>
         </w:tc>
@@ -10554,7 +11067,7 @@
                 <w:rFonts w:ascii="微软雅黑" w:hAnsi="微软雅黑" w:eastAsia="微软雅黑"/>
                 <w:sz w:val="18"/>
               </w:rPr>
-              <w:t>检查泄漏</w:t>
+              <w:t>全量（三类对比 + 三层测试集）</w:t>
             </w:r>
           </w:p>
         </w:tc>
@@ -10569,148 +11082,7 @@
                 <w:rFonts w:ascii="微软雅黑" w:hAnsi="微软雅黑" w:eastAsia="微软雅黑"/>
                 <w:sz w:val="18"/>
               </w:rPr>
-              <w:t>高</w:t>
-            </w:r>
-          </w:p>
-        </w:tc>
-      </w:tr>
-      <w:tr>
-        <w:tc>
-          <w:tcPr>
-            <w:tcW w:type="dxa" w:w="2880"/>
-          </w:tcPr>
-          <w:p>
-            <w:r/>
-            <w:r>
-              <w:rPr>
-                <w:rFonts w:ascii="微软雅黑" w:hAnsi="微软雅黑" w:eastAsia="微软雅黑"/>
-                <w:sz w:val="18"/>
-              </w:rPr>
-              <w:t>多次初始化/释放</w:t>
-            </w:r>
-          </w:p>
-        </w:tc>
-        <w:tc>
-          <w:tcPr>
-            <w:tcW w:type="dxa" w:w="2880"/>
-          </w:tcPr>
-          <w:p>
-            <w:r/>
-            <w:r>
-              <w:rPr>
-                <w:rFonts w:ascii="微软雅黑" w:hAnsi="微软雅黑" w:eastAsia="微软雅黑"/>
-                <w:sz w:val="18"/>
-              </w:rPr>
-              <w:t>检查资源释放</w:t>
-            </w:r>
-          </w:p>
-        </w:tc>
-        <w:tc>
-          <w:tcPr>
-            <w:tcW w:type="dxa" w:w="2880"/>
-          </w:tcPr>
-          <w:p>
-            <w:r/>
-            <w:r>
-              <w:rPr>
-                <w:rFonts w:ascii="微软雅黑" w:hAnsi="微软雅黑" w:eastAsia="微软雅黑"/>
-                <w:sz w:val="18"/>
-              </w:rPr>
-              <w:t>高</w:t>
-            </w:r>
-          </w:p>
-        </w:tc>
-      </w:tr>
-      <w:tr>
-        <w:tc>
-          <w:tcPr>
-            <w:tcW w:type="dxa" w:w="2880"/>
-          </w:tcPr>
-          <w:p>
-            <w:r/>
-            <w:r>
-              <w:rPr>
-                <w:rFonts w:ascii="微软雅黑" w:hAnsi="微软雅黑" w:eastAsia="微软雅黑"/>
-                <w:sz w:val="18"/>
-              </w:rPr>
-              <w:t>长时间循环推理</w:t>
-            </w:r>
-          </w:p>
-        </w:tc>
-        <w:tc>
-          <w:tcPr>
-            <w:tcW w:type="dxa" w:w="2880"/>
-          </w:tcPr>
-          <w:p>
-            <w:r/>
-            <w:r>
-              <w:rPr>
-                <w:rFonts w:ascii="微软雅黑" w:hAnsi="微软雅黑" w:eastAsia="微软雅黑"/>
-                <w:sz w:val="18"/>
-              </w:rPr>
-              <w:t>检查慢性泄漏</w:t>
-            </w:r>
-          </w:p>
-        </w:tc>
-        <w:tc>
-          <w:tcPr>
-            <w:tcW w:type="dxa" w:w="2880"/>
-          </w:tcPr>
-          <w:p>
-            <w:r/>
-            <w:r>
-              <w:rPr>
-                <w:rFonts w:ascii="微软雅黑" w:hAnsi="微软雅黑" w:eastAsia="微软雅黑"/>
-                <w:sz w:val="18"/>
-              </w:rPr>
-              <w:t>高</w:t>
-            </w:r>
-          </w:p>
-        </w:tc>
-      </w:tr>
-      <w:tr>
-        <w:tc>
-          <w:tcPr>
-            <w:tcW w:type="dxa" w:w="2880"/>
-          </w:tcPr>
-          <w:p>
-            <w:r/>
-            <w:r>
-              <w:rPr>
-                <w:rFonts w:ascii="微软雅黑" w:hAnsi="微软雅黑" w:eastAsia="微软雅黑"/>
-                <w:sz w:val="18"/>
-              </w:rPr>
-              <w:t>异常输入/空输入</w:t>
-            </w:r>
-          </w:p>
-        </w:tc>
-        <w:tc>
-          <w:tcPr>
-            <w:tcW w:type="dxa" w:w="2880"/>
-          </w:tcPr>
-          <w:p>
-            <w:r/>
-            <w:r>
-              <w:rPr>
-                <w:rFonts w:ascii="微软雅黑" w:hAnsi="微软雅黑" w:eastAsia="微软雅黑"/>
-                <w:sz w:val="18"/>
-              </w:rPr>
-              <w:t>检查异常路径释放</w:t>
-            </w:r>
-          </w:p>
-        </w:tc>
-        <w:tc>
-          <w:tcPr>
-            <w:tcW w:type="dxa" w:w="2880"/>
-          </w:tcPr>
-          <w:p>
-            <w:r/>
-            <w:r>
-              <w:rPr>
-                <w:rFonts w:ascii="微软雅黑" w:hAnsi="微软雅黑" w:eastAsia="微软雅黑"/>
-                <w:sz w:val="18"/>
-              </w:rPr>
-              <w:t>中</w:t>
+              <w:t>完整项（基础项 + 多次初始化/释放 + 长稳 + 异常输入）——代码变更是泄漏主要来源</w:t>
             </w:r>
           </w:p>
         </w:tc>
@@ -10718,173 +11090,6 @@
     </w:tbl>
     <w:p/>
     <w:p>
-      <w:r>
-        <w:rPr>
-          <w:rFonts w:ascii="微软雅黑" w:hAnsi="微软雅黑" w:eastAsia="微软雅黑"/>
-          <w:sz w:val="21"/>
-        </w:rPr>
-        <w:t>人工干预点：内存检查失败</w:t>
-      </w:r>
-    </w:p>
-    <w:p>
-      <w:r>
-        <w:rPr>
-          <w:rFonts w:ascii="微软雅黑" w:hAnsi="微软雅黑" w:eastAsia="微软雅黑"/>
-          <w:sz w:val="21"/>
-        </w:rPr>
-        <w:t>触发条件：</w:t>
-      </w:r>
-    </w:p>
-    <w:p>
-      <w:pPr>
-        <w:pStyle w:val="ListBullet"/>
-      </w:pPr>
-      <w:r>
-        <w:rPr>
-          <w:rFonts w:ascii="微软雅黑" w:hAnsi="微软雅黑" w:eastAsia="微软雅黑"/>
-          <w:sz w:val="21"/>
-        </w:rPr>
-        <w:t>内存泄漏</w:t>
-      </w:r>
-    </w:p>
-    <w:p>
-      <w:pPr>
-        <w:pStyle w:val="ListBullet"/>
-      </w:pPr>
-      <w:r>
-        <w:rPr>
-          <w:rFonts w:ascii="微软雅黑" w:hAnsi="微软雅黑" w:eastAsia="微软雅黑"/>
-          <w:sz w:val="21"/>
-        </w:rPr>
-        <w:t>峰值超限</w:t>
-      </w:r>
-    </w:p>
-    <w:p>
-      <w:pPr>
-        <w:pStyle w:val="ListBullet"/>
-      </w:pPr>
-      <w:r>
-        <w:rPr>
-          <w:rFonts w:ascii="微软雅黑" w:hAnsi="微软雅黑" w:eastAsia="微软雅黑"/>
-          <w:sz w:val="21"/>
-        </w:rPr>
-        <w:t>板端 crash</w:t>
-      </w:r>
-    </w:p>
-    <w:p>
-      <w:pPr>
-        <w:pStyle w:val="ListBullet"/>
-      </w:pPr>
-      <w:r>
-        <w:rPr>
-          <w:rFonts w:ascii="微软雅黑" w:hAnsi="微软雅黑" w:eastAsia="微软雅黑"/>
-          <w:sz w:val="21"/>
-        </w:rPr>
-        <w:t>长稳测试失败</w:t>
-      </w:r>
-    </w:p>
-    <w:p>
-      <w:r>
-        <w:rPr>
-          <w:rFonts w:ascii="微软雅黑" w:hAnsi="微软雅黑" w:eastAsia="微软雅黑"/>
-          <w:sz w:val="21"/>
-        </w:rPr>
-        <w:t>人工角色：软件/嵌入式负责人</w:t>
-      </w:r>
-    </w:p>
-    <w:p>
-      <w:r>
-        <w:rPr>
-          <w:rFonts w:ascii="微软雅黑" w:hAnsi="微软雅黑" w:eastAsia="微软雅黑"/>
-          <w:sz w:val="21"/>
-        </w:rPr>
-        <w:t>人工处理：</w:t>
-      </w:r>
-    </w:p>
-    <w:p>
-      <w:pPr>
-        <w:pStyle w:val="ListBullet"/>
-      </w:pPr>
-      <w:r>
-        <w:rPr>
-          <w:rFonts w:ascii="微软雅黑" w:hAnsi="微软雅黑" w:eastAsia="微软雅黑"/>
-          <w:sz w:val="21"/>
-        </w:rPr>
-        <w:t>查 malloc/free</w:t>
-      </w:r>
-    </w:p>
-    <w:p>
-      <w:pPr>
-        <w:pStyle w:val="ListBullet"/>
-      </w:pPr>
-      <w:r>
-        <w:rPr>
-          <w:rFonts w:ascii="微软雅黑" w:hAnsi="微软雅黑" w:eastAsia="微软雅黑"/>
-          <w:sz w:val="21"/>
-        </w:rPr>
-        <w:t>查 buffer 生命周期</w:t>
-      </w:r>
-    </w:p>
-    <w:p>
-      <w:pPr>
-        <w:pStyle w:val="ListBullet"/>
-      </w:pPr>
-      <w:r>
-        <w:rPr>
-          <w:rFonts w:ascii="微软雅黑" w:hAnsi="微软雅黑" w:eastAsia="微软雅黑"/>
-          <w:sz w:val="21"/>
-        </w:rPr>
-        <w:t>查模型加载/释放接口</w:t>
-      </w:r>
-    </w:p>
-    <w:p>
-      <w:pPr>
-        <w:pStyle w:val="ListBullet"/>
-      </w:pPr>
-      <w:r>
-        <w:rPr>
-          <w:rFonts w:ascii="微软雅黑" w:hAnsi="微软雅黑" w:eastAsia="微软雅黑"/>
-          <w:sz w:val="21"/>
-        </w:rPr>
-        <w:t>查异常路径资源释放</w:t>
-      </w:r>
-    </w:p>
-    <w:p>
-      <w:pPr>
-        <w:pStyle w:val="ListBullet"/>
-      </w:pPr>
-      <w:r>
-        <w:rPr>
-          <w:rFonts w:ascii="微软雅黑" w:hAnsi="微软雅黑" w:eastAsia="微软雅黑"/>
-          <w:sz w:val="21"/>
-        </w:rPr>
-        <w:t>查 NPU runtime 内存池</w:t>
-      </w:r>
-    </w:p>
-    <w:p>
-      <w:r>
-        <w:rPr>
-          <w:rFonts w:ascii="微软雅黑" w:hAnsi="微软雅黑" w:eastAsia="微软雅黑"/>
-          <w:sz w:val="21"/>
-        </w:rPr>
-        <w:t>处理完成：</w:t>
-      </w:r>
-    </w:p>
-    <w:p>
-      <w:pPr>
-        <w:spacing w:after="0" w:before="0"/>
-        <w:ind w:left="320"/>
-      </w:pPr>
-      <w:r>
-        <w:rPr>
-          <w:rFonts w:ascii="Consolas" w:hAnsi="Consolas" w:eastAsia="微软雅黑"/>
-          <w:color w:val="1F2937"/>
-          <w:sz w:val="18"/>
-        </w:rPr>
-        <w:t>修代码 → 重新编译 → 重新跑内存检查 → 重新跑板端回归</w:t>
-      </w:r>
-    </w:p>
-    <w:p>
       <w:pPr>
         <w:pStyle w:val="Heading3"/>
       </w:pPr>
@@ -10895,141 +11100,52 @@
           <w:color w:val="334155"/>
           <w:sz w:val="26"/>
         </w:rPr>
-        <w:t>5.5 板端验证报告</w:t>
-      </w:r>
-    </w:p>
-    <w:p>
-      <w:pPr>
-        <w:pStyle w:val="ListBullet"/>
-      </w:pPr>
-      <w:r>
-        <w:rPr>
-          <w:rFonts w:ascii="微软雅黑" w:hAnsi="微软雅黑" w:eastAsia="微软雅黑"/>
-          <w:sz w:val="21"/>
-        </w:rPr>
-        <w:t>板端驱动版本</w:t>
-      </w:r>
-    </w:p>
-    <w:p>
-      <w:pPr>
-        <w:pStyle w:val="ListBullet"/>
-      </w:pPr>
-      <w:r>
-        <w:rPr>
-          <w:rFonts w:ascii="微软雅黑" w:hAnsi="微软雅黑" w:eastAsia="微软雅黑"/>
-          <w:sz w:val="21"/>
-        </w:rPr>
-        <w:t>代码、模型文件版本</w:t>
-      </w:r>
-    </w:p>
-    <w:p>
-      <w:pPr>
-        <w:pStyle w:val="ListBullet"/>
-      </w:pPr>
-      <w:r>
-        <w:rPr>
-          <w:rFonts w:ascii="微软雅黑" w:hAnsi="微软雅黑" w:eastAsia="微软雅黑"/>
-          <w:sz w:val="21"/>
-        </w:rPr>
-        <w:t>测试集版本</w:t>
-      </w:r>
-    </w:p>
-    <w:p>
-      <w:pPr>
-        <w:pStyle w:val="ListBullet"/>
-      </w:pPr>
-      <w:r>
-        <w:rPr>
-          <w:rFonts w:ascii="微软雅黑" w:hAnsi="微软雅黑" w:eastAsia="微软雅黑"/>
-          <w:sz w:val="21"/>
-        </w:rPr>
-        <w:t>新旧结果对比</w:t>
-      </w:r>
-    </w:p>
-    <w:p>
-      <w:pPr>
-        <w:pStyle w:val="ListBullet"/>
-      </w:pPr>
-      <w:r>
-        <w:rPr>
-          <w:rFonts w:ascii="微软雅黑" w:hAnsi="微软雅黑" w:eastAsia="微软雅黑"/>
-          <w:sz w:val="21"/>
-        </w:rPr>
-        <w:t>与基准结果对比</w:t>
-      </w:r>
-    </w:p>
-    <w:p>
-      <w:pPr>
-        <w:pStyle w:val="ListBullet"/>
-      </w:pPr>
-      <w:r>
-        <w:rPr>
-          <w:rFonts w:ascii="微软雅黑" w:hAnsi="微软雅黑" w:eastAsia="微软雅黑"/>
-          <w:sz w:val="21"/>
-        </w:rPr>
-        <w:t>与仿真结果对比</w:t>
-      </w:r>
-    </w:p>
-    <w:p>
-      <w:pPr>
-        <w:pStyle w:val="ListBullet"/>
-      </w:pPr>
-      <w:r>
-        <w:rPr>
-          <w:rFonts w:ascii="微软雅黑" w:hAnsi="微软雅黑" w:eastAsia="微软雅黑"/>
-          <w:sz w:val="21"/>
-        </w:rPr>
-        <w:t>性能指标</w:t>
-      </w:r>
-    </w:p>
-    <w:p>
-      <w:pPr>
-        <w:pStyle w:val="ListBullet"/>
-      </w:pPr>
-      <w:r>
-        <w:rPr>
-          <w:rFonts w:ascii="微软雅黑" w:hAnsi="微软雅黑" w:eastAsia="微软雅黑"/>
-          <w:sz w:val="21"/>
-        </w:rPr>
-        <w:t>是否通过门禁</w:t>
-      </w:r>
-    </w:p>
-    <w:p>
-      <w:pPr>
-        <w:pStyle w:val="ListBullet"/>
-      </w:pPr>
-      <w:r>
-        <w:rPr>
-          <w:rFonts w:ascii="微软雅黑" w:hAnsi="微软雅黑" w:eastAsia="微软雅黑"/>
-          <w:sz w:val="21"/>
-        </w:rPr>
-        <w:t>未通过原因分类</w:t>
-      </w:r>
-    </w:p>
-    <w:p>
-      <w:pPr>
-        <w:pStyle w:val="ListBullet"/>
-      </w:pPr>
-      <w:r>
-        <w:rPr>
-          <w:rFonts w:ascii="微软雅黑" w:hAnsi="微软雅黑" w:eastAsia="微软雅黑"/>
-          <w:sz w:val="21"/>
-        </w:rPr>
-        <w:t>建议下一步动作</w:t>
-      </w:r>
-    </w:p>
-    <w:p>
-      <w:pPr>
-        <w:pStyle w:val="Heading2"/>
-      </w:pPr>
-      <w:r>
-        <w:rPr>
-          <w:rFonts w:ascii="微软雅黑" w:hAnsi="微软雅黑" w:eastAsia="微软雅黑"/>
-          <w:b/>
-          <w:color w:val="1E40AF"/>
-          <w:sz w:val="30"/>
-        </w:rPr>
-        <w:t>6. 部署代码编写</w:t>
+        <w:t>6.2 三类强制对比</w:t>
+      </w:r>
+    </w:p>
+    <w:p>
+      <w:pPr>
+        <w:pStyle w:val="ListNumber"/>
+      </w:pPr>
+      <w:r>
+        <w:rPr>
+          <w:rFonts w:ascii="微软雅黑" w:hAnsi="微软雅黑" w:eastAsia="微软雅黑"/>
+          <w:sz w:val="21"/>
+        </w:rPr>
+        <w:t>现有板端结果 vs 原板端结果（这版是否更好、是否修复客户问题）</w:t>
+      </w:r>
+    </w:p>
+    <w:p>
+      <w:pPr>
+        <w:pStyle w:val="ListNumber"/>
+      </w:pPr>
+      <w:r>
+        <w:rPr>
+          <w:rFonts w:ascii="微软雅黑" w:hAnsi="微软雅黑" w:eastAsia="微软雅黑"/>
+          <w:sz w:val="21"/>
+        </w:rPr>
+        <w:t>现有板端结果 vs 基准结果（是否达到目标预期）</w:t>
+      </w:r>
+    </w:p>
+    <w:p>
+      <w:pPr>
+        <w:pStyle w:val="ListNumber"/>
+      </w:pPr>
+      <w:r>
+        <w:rPr>
+          <w:rFonts w:ascii="微软雅黑" w:hAnsi="微软雅黑" w:eastAsia="微软雅黑"/>
+          <w:sz w:val="21"/>
+        </w:rPr>
+        <w:t>现有板端结果 vs 仿真器结果（板端 runtime/前后处理是否与仿真一致）</w:t>
+      </w:r>
+    </w:p>
+    <w:p>
+      <w:r>
+        <w:rPr>
+          <w:rFonts w:ascii="微软雅黑" w:hAnsi="微软雅黑" w:eastAsia="微软雅黑"/>
+          <w:sz w:val="21"/>
+        </w:rPr>
+        <w:t>第 3 类不一致时：不是模型量化问题，优先排查板端前后处理、NMS/阈值配置、runtime、模型加载。</w:t>
       </w:r>
     </w:p>
     <w:p>
@@ -11043,16 +11159,7 @@
           <w:color w:val="334155"/>
           <w:sz w:val="26"/>
         </w:rPr>
-        <w:t>6.1 是否涉及代码修改</w:t>
-      </w:r>
-    </w:p>
-    <w:p>
-      <w:r>
-        <w:rPr>
-          <w:rFonts w:ascii="微软雅黑" w:hAnsi="微软雅黑" w:eastAsia="微软雅黑"/>
-          <w:sz w:val="21"/>
-        </w:rPr>
-        <w:t>系统可以根据本次任务记录判断：</w:t>
+        <w:t>6.3 测试集与两级测试机制</w:t>
       </w:r>
     </w:p>
     <w:tbl>
@@ -11078,7 +11185,7 @@
                 <w:b/>
                 <w:sz w:val="18"/>
               </w:rPr>
-              <w:t>情况</w:t>
+              <w:t>测试集</w:t>
             </w:r>
           </w:p>
         </w:tc>
@@ -11094,7 +11201,7 @@
                 <w:b/>
                 <w:sz w:val="18"/>
               </w:rPr>
-              <w:t>是否代码修改</w:t>
+              <w:t>作用</w:t>
             </w:r>
           </w:p>
         </w:tc>
@@ -11111,7 +11218,7 @@
                 <w:rFonts w:ascii="微软雅黑" w:hAnsi="微软雅黑" w:eastAsia="微软雅黑"/>
                 <w:sz w:val="18"/>
               </w:rPr>
-              <w:t>只替换模型文件</w:t>
+              <w:t>本次 badcase 验证集</w:t>
             </w:r>
           </w:p>
         </w:tc>
@@ -11126,7 +11233,7 @@
                 <w:rFonts w:ascii="微软雅黑" w:hAnsi="微软雅黑" w:eastAsia="微软雅黑"/>
                 <w:sz w:val="18"/>
               </w:rPr>
-              <w:t>否</w:t>
+              <w:t>验证客户问题是否修复</w:t>
             </w:r>
           </w:p>
         </w:tc>
@@ -11143,7 +11250,7 @@
                 <w:rFonts w:ascii="微软雅黑" w:hAnsi="微软雅黑" w:eastAsia="微软雅黑"/>
                 <w:sz w:val="18"/>
               </w:rPr>
-              <w:t>修改阈值 / NMS 配置文件</w:t>
+              <w:t>历史问题回归集</w:t>
             </w:r>
           </w:p>
         </w:tc>
@@ -11158,7 +11265,7 @@
                 <w:rFonts w:ascii="微软雅黑" w:hAnsi="微软雅黑" w:eastAsia="微软雅黑"/>
                 <w:sz w:val="18"/>
               </w:rPr>
-              <w:t>可能否，视配置管理方式</w:t>
+              <w:t>验证过往问题是否复发</w:t>
             </w:r>
           </w:p>
         </w:tc>
@@ -11175,7 +11282,7 @@
                 <w:rFonts w:ascii="微软雅黑" w:hAnsi="微软雅黑" w:eastAsia="微软雅黑"/>
                 <w:sz w:val="18"/>
               </w:rPr>
-              <w:t>修改前处理 / 后处理代码</w:t>
+              <w:t>专业测试集</w:t>
             </w:r>
           </w:p>
         </w:tc>
@@ -11190,135 +11297,7 @@
                 <w:rFonts w:ascii="微软雅黑" w:hAnsi="微软雅黑" w:eastAsia="微软雅黑"/>
                 <w:sz w:val="18"/>
               </w:rPr>
-              <w:t>是</w:t>
-            </w:r>
-          </w:p>
-        </w:tc>
-      </w:tr>
-      <w:tr>
-        <w:tc>
-          <w:tcPr>
-            <w:tcW w:type="dxa" w:w="4320"/>
-          </w:tcPr>
-          <w:p>
-            <w:r/>
-            <w:r>
-              <w:rPr>
-                <w:rFonts w:ascii="微软雅黑" w:hAnsi="微软雅黑" w:eastAsia="微软雅黑"/>
-                <w:sz w:val="18"/>
-              </w:rPr>
-              <w:t>V821 生成新的 .c / .h 并影响工程编译</w:t>
-            </w:r>
-          </w:p>
-        </w:tc>
-        <w:tc>
-          <w:tcPr>
-            <w:tcW w:type="dxa" w:w="4320"/>
-          </w:tcPr>
-          <w:p>
-            <w:r/>
-            <w:r>
-              <w:rPr>
-                <w:rFonts w:ascii="微软雅黑" w:hAnsi="微软雅黑" w:eastAsia="微软雅黑"/>
-                <w:sz w:val="18"/>
-              </w:rPr>
-              <w:t>是</w:t>
-            </w:r>
-          </w:p>
-        </w:tc>
-      </w:tr>
-      <w:tr>
-        <w:tc>
-          <w:tcPr>
-            <w:tcW w:type="dxa" w:w="4320"/>
-          </w:tcPr>
-          <w:p>
-            <w:r/>
-            <w:r>
-              <w:rPr>
-                <w:rFonts w:ascii="微软雅黑" w:hAnsi="微软雅黑" w:eastAsia="微软雅黑"/>
-                <w:sz w:val="18"/>
-              </w:rPr>
-              <w:t>修改 main_backend 参数读取</w:t>
-            </w:r>
-          </w:p>
-        </w:tc>
-        <w:tc>
-          <w:tcPr>
-            <w:tcW w:type="dxa" w:w="4320"/>
-          </w:tcPr>
-          <w:p>
-            <w:r/>
-            <w:r>
-              <w:rPr>
-                <w:rFonts w:ascii="微软雅黑" w:hAnsi="微软雅黑" w:eastAsia="微软雅黑"/>
-                <w:sz w:val="18"/>
-              </w:rPr>
-              <w:t>是</w:t>
-            </w:r>
-          </w:p>
-        </w:tc>
-      </w:tr>
-      <w:tr>
-        <w:tc>
-          <w:tcPr>
-            <w:tcW w:type="dxa" w:w="4320"/>
-          </w:tcPr>
-          <w:p>
-            <w:r/>
-            <w:r>
-              <w:rPr>
-                <w:rFonts w:ascii="微软雅黑" w:hAnsi="微软雅黑" w:eastAsia="微软雅黑"/>
-                <w:sz w:val="18"/>
-              </w:rPr>
-              <w:t>修改板端推理流程</w:t>
-            </w:r>
-          </w:p>
-        </w:tc>
-        <w:tc>
-          <w:tcPr>
-            <w:tcW w:type="dxa" w:w="4320"/>
-          </w:tcPr>
-          <w:p>
-            <w:r/>
-            <w:r>
-              <w:rPr>
-                <w:rFonts w:ascii="微软雅黑" w:hAnsi="微软雅黑" w:eastAsia="微软雅黑"/>
-                <w:sz w:val="18"/>
-              </w:rPr>
-              <w:t>是</w:t>
-            </w:r>
-          </w:p>
-        </w:tc>
-      </w:tr>
-      <w:tr>
-        <w:tc>
-          <w:tcPr>
-            <w:tcW w:type="dxa" w:w="4320"/>
-          </w:tcPr>
-          <w:p>
-            <w:r/>
-            <w:r>
-              <w:rPr>
-                <w:rFonts w:ascii="微软雅黑" w:hAnsi="微软雅黑" w:eastAsia="微软雅黑"/>
-                <w:sz w:val="18"/>
-              </w:rPr>
-              <w:t>修改 SDK / runtime 配置</w:t>
-            </w:r>
-          </w:p>
-        </w:tc>
-        <w:tc>
-          <w:tcPr>
-            <w:tcW w:type="dxa" w:w="4320"/>
-          </w:tcPr>
-          <w:p>
-            <w:r/>
-            <w:r>
-              <w:rPr>
-                <w:rFonts w:ascii="微软雅黑" w:hAnsi="微软雅黑" w:eastAsia="微软雅黑"/>
-                <w:sz w:val="18"/>
-              </w:rPr>
-              <w:t>是</w:t>
+              <w:t>验证大盘指标是否稳定</w:t>
             </w:r>
           </w:p>
         </w:tc>
@@ -11326,6 +11305,67 @@
     </w:tbl>
     <w:p/>
     <w:p>
+      <w:r>
+        <w:rPr>
+          <w:rFonts w:ascii="微软雅黑" w:hAnsi="微软雅黑" w:eastAsia="微软雅黑"/>
+          <w:sz w:val="21"/>
+        </w:rPr>
+        <w:t>板端跑测耗时较长时，采用两级机制：</w:t>
+      </w:r>
+    </w:p>
+    <w:p>
+      <w:pPr>
+        <w:pStyle w:val="ListBullet"/>
+      </w:pPr>
+      <w:r>
+        <w:rPr>
+          <w:rFonts w:ascii="微软雅黑" w:hAnsi="微软雅黑" w:eastAsia="微软雅黑"/>
+          <w:sz w:val="21"/>
+        </w:rPr>
+      </w:r>
+      <w:r>
+        <w:rPr>
+          <w:rFonts w:ascii="微软雅黑" w:hAnsi="微软雅黑" w:eastAsia="微软雅黑"/>
+          <w:b/>
+          <w:sz w:val="21"/>
+        </w:rPr>
+        <w:t>快速门禁集</w:t>
+      </w:r>
+      <w:r>
+        <w:rPr>
+          <w:rFonts w:ascii="微软雅黑" w:hAnsi="微软雅黑" w:eastAsia="微软雅黑"/>
+          <w:sz w:val="21"/>
+        </w:rPr>
+        <w:t>（每次必跑）：本次 badcase + 小规模历史核心集，快速淘汰明显不合格版本</w:t>
+      </w:r>
+    </w:p>
+    <w:p>
+      <w:pPr>
+        <w:pStyle w:val="ListBullet"/>
+      </w:pPr>
+      <w:r>
+        <w:rPr>
+          <w:rFonts w:ascii="微软雅黑" w:hAnsi="微软雅黑" w:eastAsia="微软雅黑"/>
+          <w:sz w:val="21"/>
+        </w:rPr>
+      </w:r>
+      <w:r>
+        <w:rPr>
+          <w:rFonts w:ascii="微软雅黑" w:hAnsi="微软雅黑" w:eastAsia="微软雅黑"/>
+          <w:b/>
+          <w:sz w:val="21"/>
+        </w:rPr>
+        <w:t>完整回归集</w:t>
+      </w:r>
+      <w:r>
+        <w:rPr>
+          <w:rFonts w:ascii="微软雅黑" w:hAnsi="微软雅黑" w:eastAsia="微软雅黑"/>
+          <w:sz w:val="21"/>
+        </w:rPr>
+        <w:t>（快速门禁通过后跑）：专业测试集 + 全量历史问题集 + 性能/长稳测试</w:t>
+      </w:r>
+    </w:p>
+    <w:p>
       <w:pPr>
         <w:pStyle w:val="Heading3"/>
       </w:pPr>
@@ -11336,16 +11376,605 @@
           <w:color w:val="334155"/>
           <w:sz w:val="26"/>
         </w:rPr>
-        <w:t>6.2 分支 A：只更新模型，不改代码</w:t>
-      </w:r>
-    </w:p>
-    <w:p>
-      <w:r>
-        <w:rPr>
-          <w:rFonts w:ascii="微软雅黑" w:hAnsi="微软雅黑" w:eastAsia="微软雅黑"/>
-          <w:sz w:val="21"/>
-        </w:rPr>
-        <w:t>自动动作：</w:t>
+        <w:t>6.4 达标标准（建议在进入转换前就写进任务单）</w:t>
+      </w:r>
+    </w:p>
+    <w:p>
+      <w:r>
+        <w:rPr>
+          <w:rFonts w:ascii="微软雅黑" w:hAnsi="微软雅黑" w:eastAsia="微软雅黑"/>
+          <w:sz w:val="21"/>
+        </w:rPr>
+        <w:t>客户问题修复标准：</w:t>
+      </w:r>
+    </w:p>
+    <w:p>
+      <w:pPr>
+        <w:pStyle w:val="ListBullet"/>
+      </w:pPr>
+      <w:r>
+        <w:rPr>
+          <w:rFonts w:ascii="微软雅黑" w:hAnsi="微软雅黑" w:eastAsia="微软雅黑"/>
+          <w:sz w:val="21"/>
+        </w:rPr>
+        <w:t>本次 badcase：FP 消除率 ≥ 80%，FN 召回率 ≥ 80%</w:t>
+      </w:r>
+    </w:p>
+    <w:p>
+      <w:pPr>
+        <w:pStyle w:val="ListBullet"/>
+      </w:pPr>
+      <w:r>
+        <w:rPr>
+          <w:rFonts w:ascii="微软雅黑" w:hAnsi="微软雅黑" w:eastAsia="微软雅黑"/>
+          <w:sz w:val="21"/>
+        </w:rPr>
+        <w:t>关键客户指定 case 必须 100% 通过</w:t>
+      </w:r>
+    </w:p>
+    <w:p>
+      <w:r>
+        <w:rPr>
+          <w:rFonts w:ascii="微软雅黑" w:hAnsi="微软雅黑" w:eastAsia="微软雅黑"/>
+          <w:sz w:val="21"/>
+        </w:rPr>
+        <w:t>历史回归标准：</w:t>
+      </w:r>
+    </w:p>
+    <w:p>
+      <w:pPr>
+        <w:pStyle w:val="ListBullet"/>
+      </w:pPr>
+      <w:r>
+        <w:rPr>
+          <w:rFonts w:ascii="微软雅黑" w:hAnsi="微软雅黑" w:eastAsia="微软雅黑"/>
+          <w:sz w:val="21"/>
+        </w:rPr>
+        <w:t>历史问题集不得新增严重 FP/FN</w:t>
+      </w:r>
+    </w:p>
+    <w:p>
+      <w:pPr>
+        <w:pStyle w:val="ListBullet"/>
+      </w:pPr>
+      <w:r>
+        <w:rPr>
+          <w:rFonts w:ascii="微软雅黑" w:hAnsi="微软雅黑" w:eastAsia="微软雅黑"/>
+          <w:sz w:val="21"/>
+        </w:rPr>
+        <w:t>关键历史 case 通过率 100%</w:t>
+      </w:r>
+    </w:p>
+    <w:p>
+      <w:r>
+        <w:rPr>
+          <w:rFonts w:ascii="微软雅黑" w:hAnsi="微软雅黑" w:eastAsia="微软雅黑"/>
+          <w:sz w:val="21"/>
+        </w:rPr>
+        <w:t>板端性能标准：</w:t>
+      </w:r>
+    </w:p>
+    <w:p>
+      <w:pPr>
+        <w:pStyle w:val="ListBullet"/>
+      </w:pPr>
+      <w:r>
+        <w:rPr>
+          <w:rFonts w:ascii="微软雅黑" w:hAnsi="微软雅黑" w:eastAsia="微软雅黑"/>
+          <w:sz w:val="21"/>
+        </w:rPr>
+        <w:t>帧率不低于要求</w:t>
+      </w:r>
+    </w:p>
+    <w:p>
+      <w:pPr>
+        <w:pStyle w:val="ListBullet"/>
+      </w:pPr>
+      <w:r>
+        <w:rPr>
+          <w:rFonts w:ascii="微软雅黑" w:hAnsi="微软雅黑" w:eastAsia="微软雅黑"/>
+          <w:sz w:val="21"/>
+        </w:rPr>
+        <w:t>内存不超过限制</w:t>
+      </w:r>
+    </w:p>
+    <w:p>
+      <w:pPr>
+        <w:pStyle w:val="ListBullet"/>
+      </w:pPr>
+      <w:r>
+        <w:rPr>
+          <w:rFonts w:ascii="微软雅黑" w:hAnsi="微软雅黑" w:eastAsia="微软雅黑"/>
+          <w:sz w:val="21"/>
+        </w:rPr>
+        <w:t>模型加载正常</w:t>
+      </w:r>
+    </w:p>
+    <w:p>
+      <w:pPr>
+        <w:pStyle w:val="ListBullet"/>
+      </w:pPr>
+      <w:r>
+        <w:rPr>
+          <w:rFonts w:ascii="微软雅黑" w:hAnsi="微软雅黑" w:eastAsia="微软雅黑"/>
+          <w:sz w:val="21"/>
+        </w:rPr>
+        <w:t>长时间运行无异常</w:t>
+      </w:r>
+    </w:p>
+    <w:p>
+      <w:pPr>
+        <w:pStyle w:val="Heading3"/>
+      </w:pPr>
+      <w:r>
+        <w:rPr>
+          <w:rFonts w:ascii="微软雅黑" w:hAnsi="微软雅黑" w:eastAsia="微软雅黑"/>
+          <w:b/>
+          <w:color w:val="334155"/>
+          <w:sz w:val="26"/>
+        </w:rPr>
+        <w:t>6.5 内存检查（全流程唯一入口）</w:t>
+      </w:r>
+    </w:p>
+    <w:tbl>
+      <w:tblPr>
+        <w:tblStyle w:val="TableGrid"/>
+        <w:tblW w:type="auto" w:w="0"/>
+        <w:tblLook w:firstColumn="1" w:firstRow="1" w:lastColumn="0" w:lastRow="0" w:noHBand="0" w:noVBand="1" w:val="04A0"/>
+      </w:tblPr>
+      <w:tblGrid>
+        <w:gridCol w:w="2160"/>
+        <w:gridCol w:w="2160"/>
+        <w:gridCol w:w="2160"/>
+        <w:gridCol w:w="2160"/>
+      </w:tblGrid>
+      <w:tr>
+        <w:tc>
+          <w:tcPr>
+            <w:tcW w:type="dxa" w:w="2160"/>
+          </w:tcPr>
+          <w:p>
+            <w:r/>
+            <w:r>
+              <w:rPr>
+                <w:rFonts w:ascii="微软雅黑" w:hAnsi="微软雅黑" w:eastAsia="微软雅黑"/>
+                <w:b/>
+                <w:sz w:val="18"/>
+              </w:rPr>
+              <w:t>检查项</w:t>
+            </w:r>
+          </w:p>
+        </w:tc>
+        <w:tc>
+          <w:tcPr>
+            <w:tcW w:type="dxa" w:w="2160"/>
+          </w:tcPr>
+          <w:p>
+            <w:r/>
+            <w:r>
+              <w:rPr>
+                <w:rFonts w:ascii="微软雅黑" w:hAnsi="微软雅黑" w:eastAsia="微软雅黑"/>
+                <w:b/>
+                <w:sz w:val="18"/>
+              </w:rPr>
+              <w:t>目的</w:t>
+            </w:r>
+          </w:p>
+        </w:tc>
+        <w:tc>
+          <w:tcPr>
+            <w:tcW w:type="dxa" w:w="2160"/>
+          </w:tcPr>
+          <w:p>
+            <w:r/>
+            <w:r>
+              <w:rPr>
+                <w:rFonts w:ascii="微软雅黑" w:hAnsi="微软雅黑" w:eastAsia="微软雅黑"/>
+                <w:b/>
+                <w:sz w:val="18"/>
+              </w:rPr>
+              <w:t>适用分支</w:t>
+            </w:r>
+          </w:p>
+        </w:tc>
+        <w:tc>
+          <w:tcPr>
+            <w:tcW w:type="dxa" w:w="2160"/>
+          </w:tcPr>
+          <w:p>
+            <w:r/>
+            <w:r>
+              <w:rPr>
+                <w:rFonts w:ascii="微软雅黑" w:hAnsi="微软雅黑" w:eastAsia="微软雅黑"/>
+                <w:b/>
+                <w:sz w:val="18"/>
+              </w:rPr>
+              <w:t>自动化程度</w:t>
+            </w:r>
+          </w:p>
+        </w:tc>
+      </w:tr>
+      <w:tr>
+        <w:tc>
+          <w:tcPr>
+            <w:tcW w:type="dxa" w:w="2160"/>
+          </w:tcPr>
+          <w:p>
+            <w:r/>
+            <w:r>
+              <w:rPr>
+                <w:rFonts w:ascii="微软雅黑" w:hAnsi="微软雅黑" w:eastAsia="微软雅黑"/>
+                <w:sz w:val="18"/>
+              </w:rPr>
+              <w:t>模型加载内存峰值</w:t>
+            </w:r>
+          </w:p>
+        </w:tc>
+        <w:tc>
+          <w:tcPr>
+            <w:tcW w:type="dxa" w:w="2160"/>
+          </w:tcPr>
+          <w:p>
+            <w:r/>
+            <w:r>
+              <w:rPr>
+                <w:rFonts w:ascii="微软雅黑" w:hAnsi="微软雅黑" w:eastAsia="微软雅黑"/>
+                <w:sz w:val="18"/>
+              </w:rPr>
+              <w:t>防止超出板端限制</w:t>
+            </w:r>
+          </w:p>
+        </w:tc>
+        <w:tc>
+          <w:tcPr>
+            <w:tcW w:type="dxa" w:w="2160"/>
+          </w:tcPr>
+          <w:p>
+            <w:r/>
+            <w:r>
+              <w:rPr>
+                <w:rFonts w:ascii="微软雅黑" w:hAnsi="微软雅黑" w:eastAsia="微软雅黑"/>
+                <w:sz w:val="18"/>
+              </w:rPr>
+              <w:t>A + B</w:t>
+            </w:r>
+          </w:p>
+        </w:tc>
+        <w:tc>
+          <w:tcPr>
+            <w:tcW w:type="dxa" w:w="2160"/>
+          </w:tcPr>
+          <w:p>
+            <w:r/>
+            <w:r>
+              <w:rPr>
+                <w:rFonts w:ascii="微软雅黑" w:hAnsi="微软雅黑" w:eastAsia="微软雅黑"/>
+                <w:sz w:val="18"/>
+              </w:rPr>
+              <w:t>高</w:t>
+            </w:r>
+          </w:p>
+        </w:tc>
+      </w:tr>
+      <w:tr>
+        <w:tc>
+          <w:tcPr>
+            <w:tcW w:type="dxa" w:w="2160"/>
+          </w:tcPr>
+          <w:p>
+            <w:r/>
+            <w:r>
+              <w:rPr>
+                <w:rFonts w:ascii="微软雅黑" w:hAnsi="微软雅黑" w:eastAsia="微软雅黑"/>
+                <w:sz w:val="18"/>
+              </w:rPr>
+              <w:t>推理过程中内存增长</w:t>
+            </w:r>
+          </w:p>
+        </w:tc>
+        <w:tc>
+          <w:tcPr>
+            <w:tcW w:type="dxa" w:w="2160"/>
+          </w:tcPr>
+          <w:p>
+            <w:r/>
+            <w:r>
+              <w:rPr>
+                <w:rFonts w:ascii="微软雅黑" w:hAnsi="微软雅黑" w:eastAsia="微软雅黑"/>
+                <w:sz w:val="18"/>
+              </w:rPr>
+              <w:t>检查泄漏</w:t>
+            </w:r>
+          </w:p>
+        </w:tc>
+        <w:tc>
+          <w:tcPr>
+            <w:tcW w:type="dxa" w:w="2160"/>
+          </w:tcPr>
+          <w:p>
+            <w:r/>
+            <w:r>
+              <w:rPr>
+                <w:rFonts w:ascii="微软雅黑" w:hAnsi="微软雅黑" w:eastAsia="微软雅黑"/>
+                <w:sz w:val="18"/>
+              </w:rPr>
+              <w:t>A + B</w:t>
+            </w:r>
+          </w:p>
+        </w:tc>
+        <w:tc>
+          <w:tcPr>
+            <w:tcW w:type="dxa" w:w="2160"/>
+          </w:tcPr>
+          <w:p>
+            <w:r/>
+            <w:r>
+              <w:rPr>
+                <w:rFonts w:ascii="微软雅黑" w:hAnsi="微软雅黑" w:eastAsia="微软雅黑"/>
+                <w:sz w:val="18"/>
+              </w:rPr>
+              <w:t>高</w:t>
+            </w:r>
+          </w:p>
+        </w:tc>
+      </w:tr>
+      <w:tr>
+        <w:tc>
+          <w:tcPr>
+            <w:tcW w:type="dxa" w:w="2160"/>
+          </w:tcPr>
+          <w:p>
+            <w:r/>
+            <w:r>
+              <w:rPr>
+                <w:rFonts w:ascii="微软雅黑" w:hAnsi="微软雅黑" w:eastAsia="微软雅黑"/>
+                <w:sz w:val="18"/>
+              </w:rPr>
+              <w:t>释放后内存回落基线</w:t>
+            </w:r>
+          </w:p>
+        </w:tc>
+        <w:tc>
+          <w:tcPr>
+            <w:tcW w:type="dxa" w:w="2160"/>
+          </w:tcPr>
+          <w:p>
+            <w:r/>
+            <w:r>
+              <w:rPr>
+                <w:rFonts w:ascii="微软雅黑" w:hAnsi="微软雅黑" w:eastAsia="微软雅黑"/>
+                <w:sz w:val="18"/>
+              </w:rPr>
+              <w:t>检查资源释放</w:t>
+            </w:r>
+          </w:p>
+        </w:tc>
+        <w:tc>
+          <w:tcPr>
+            <w:tcW w:type="dxa" w:w="2160"/>
+          </w:tcPr>
+          <w:p>
+            <w:r/>
+            <w:r>
+              <w:rPr>
+                <w:rFonts w:ascii="微软雅黑" w:hAnsi="微软雅黑" w:eastAsia="微软雅黑"/>
+                <w:sz w:val="18"/>
+              </w:rPr>
+              <w:t>A + B</w:t>
+            </w:r>
+          </w:p>
+        </w:tc>
+        <w:tc>
+          <w:tcPr>
+            <w:tcW w:type="dxa" w:w="2160"/>
+          </w:tcPr>
+          <w:p>
+            <w:r/>
+            <w:r>
+              <w:rPr>
+                <w:rFonts w:ascii="微软雅黑" w:hAnsi="微软雅黑" w:eastAsia="微软雅黑"/>
+                <w:sz w:val="18"/>
+              </w:rPr>
+              <w:t>高</w:t>
+            </w:r>
+          </w:p>
+        </w:tc>
+      </w:tr>
+      <w:tr>
+        <w:tc>
+          <w:tcPr>
+            <w:tcW w:type="dxa" w:w="2160"/>
+          </w:tcPr>
+          <w:p>
+            <w:r/>
+            <w:r>
+              <w:rPr>
+                <w:rFonts w:ascii="微软雅黑" w:hAnsi="微软雅黑" w:eastAsia="微软雅黑"/>
+                <w:sz w:val="18"/>
+              </w:rPr>
+              <w:t>多次初始化/释放</w:t>
+            </w:r>
+          </w:p>
+        </w:tc>
+        <w:tc>
+          <w:tcPr>
+            <w:tcW w:type="dxa" w:w="2160"/>
+          </w:tcPr>
+          <w:p>
+            <w:r/>
+            <w:r>
+              <w:rPr>
+                <w:rFonts w:ascii="微软雅黑" w:hAnsi="微软雅黑" w:eastAsia="微软雅黑"/>
+                <w:sz w:val="18"/>
+              </w:rPr>
+              <w:t>检查反复加载释放</w:t>
+            </w:r>
+          </w:p>
+        </w:tc>
+        <w:tc>
+          <w:tcPr>
+            <w:tcW w:type="dxa" w:w="2160"/>
+          </w:tcPr>
+          <w:p>
+            <w:r/>
+            <w:r>
+              <w:rPr>
+                <w:rFonts w:ascii="微软雅黑" w:hAnsi="微软雅黑" w:eastAsia="微软雅黑"/>
+                <w:sz w:val="18"/>
+              </w:rPr>
+              <w:t>B</w:t>
+            </w:r>
+          </w:p>
+        </w:tc>
+        <w:tc>
+          <w:tcPr>
+            <w:tcW w:type="dxa" w:w="2160"/>
+          </w:tcPr>
+          <w:p>
+            <w:r/>
+            <w:r>
+              <w:rPr>
+                <w:rFonts w:ascii="微软雅黑" w:hAnsi="微软雅黑" w:eastAsia="微软雅黑"/>
+                <w:sz w:val="18"/>
+              </w:rPr>
+              <w:t>高</w:t>
+            </w:r>
+          </w:p>
+        </w:tc>
+      </w:tr>
+      <w:tr>
+        <w:tc>
+          <w:tcPr>
+            <w:tcW w:type="dxa" w:w="2160"/>
+          </w:tcPr>
+          <w:p>
+            <w:r/>
+            <w:r>
+              <w:rPr>
+                <w:rFonts w:ascii="微软雅黑" w:hAnsi="微软雅黑" w:eastAsia="微软雅黑"/>
+                <w:sz w:val="18"/>
+              </w:rPr>
+              <w:t>长时间循环推理</w:t>
+            </w:r>
+          </w:p>
+        </w:tc>
+        <w:tc>
+          <w:tcPr>
+            <w:tcW w:type="dxa" w:w="2160"/>
+          </w:tcPr>
+          <w:p>
+            <w:r/>
+            <w:r>
+              <w:rPr>
+                <w:rFonts w:ascii="微软雅黑" w:hAnsi="微软雅黑" w:eastAsia="微软雅黑"/>
+                <w:sz w:val="18"/>
+              </w:rPr>
+              <w:t>检查慢性泄漏</w:t>
+            </w:r>
+          </w:p>
+        </w:tc>
+        <w:tc>
+          <w:tcPr>
+            <w:tcW w:type="dxa" w:w="2160"/>
+          </w:tcPr>
+          <w:p>
+            <w:r/>
+            <w:r>
+              <w:rPr>
+                <w:rFonts w:ascii="微软雅黑" w:hAnsi="微软雅黑" w:eastAsia="微软雅黑"/>
+                <w:sz w:val="18"/>
+              </w:rPr>
+              <w:t>B</w:t>
+            </w:r>
+          </w:p>
+        </w:tc>
+        <w:tc>
+          <w:tcPr>
+            <w:tcW w:type="dxa" w:w="2160"/>
+          </w:tcPr>
+          <w:p>
+            <w:r/>
+            <w:r>
+              <w:rPr>
+                <w:rFonts w:ascii="微软雅黑" w:hAnsi="微软雅黑" w:eastAsia="微软雅黑"/>
+                <w:sz w:val="18"/>
+              </w:rPr>
+              <w:t>高</w:t>
+            </w:r>
+          </w:p>
+        </w:tc>
+      </w:tr>
+      <w:tr>
+        <w:tc>
+          <w:tcPr>
+            <w:tcW w:type="dxa" w:w="2160"/>
+          </w:tcPr>
+          <w:p>
+            <w:r/>
+            <w:r>
+              <w:rPr>
+                <w:rFonts w:ascii="微软雅黑" w:hAnsi="微软雅黑" w:eastAsia="微软雅黑"/>
+                <w:sz w:val="18"/>
+              </w:rPr>
+              <w:t>异常输入/空输入</w:t>
+            </w:r>
+          </w:p>
+        </w:tc>
+        <w:tc>
+          <w:tcPr>
+            <w:tcW w:type="dxa" w:w="2160"/>
+          </w:tcPr>
+          <w:p>
+            <w:r/>
+            <w:r>
+              <w:rPr>
+                <w:rFonts w:ascii="微软雅黑" w:hAnsi="微软雅黑" w:eastAsia="微软雅黑"/>
+                <w:sz w:val="18"/>
+              </w:rPr>
+              <w:t>检查异常路径释放</w:t>
+            </w:r>
+          </w:p>
+        </w:tc>
+        <w:tc>
+          <w:tcPr>
+            <w:tcW w:type="dxa" w:w="2160"/>
+          </w:tcPr>
+          <w:p>
+            <w:r/>
+            <w:r>
+              <w:rPr>
+                <w:rFonts w:ascii="微软雅黑" w:hAnsi="微软雅黑" w:eastAsia="微软雅黑"/>
+                <w:sz w:val="18"/>
+              </w:rPr>
+              <w:t>B</w:t>
+            </w:r>
+          </w:p>
+        </w:tc>
+        <w:tc>
+          <w:tcPr>
+            <w:tcW w:type="dxa" w:w="2160"/>
+          </w:tcPr>
+          <w:p>
+            <w:r/>
+            <w:r>
+              <w:rPr>
+                <w:rFonts w:ascii="微软雅黑" w:hAnsi="微软雅黑" w:eastAsia="微软雅黑"/>
+                <w:sz w:val="18"/>
+              </w:rPr>
+              <w:t>中</w:t>
+            </w:r>
+          </w:p>
+        </w:tc>
+      </w:tr>
+    </w:tbl>
+    <w:p/>
+    <w:p>
+      <w:r>
+        <w:rPr>
+          <w:rFonts w:ascii="微软雅黑" w:hAnsi="微软雅黑" w:eastAsia="微软雅黑"/>
+          <w:sz w:val="21"/>
+        </w:rPr>
+        <w:t>推荐执行流程：</w:t>
       </w:r>
     </w:p>
     <w:p>
@@ -11359,7 +11988,7 @@
           <w:color w:val="1F2937"/>
           <w:sz w:val="18"/>
         </w:rPr>
-        <w:t>收集模型交付物</w:t>
+        <w:t>板端启动 → 记录初始内存</w:t>
       </w:r>
     </w:p>
     <w:p>
@@ -11373,7 +12002,7 @@
           <w:color w:val="1F2937"/>
           <w:sz w:val="18"/>
         </w:rPr>
-        <w:t xml:space="preserve">  → 收集配置文件</w:t>
+        <w:t xml:space="preserve">  → 加载模型 → 记录加载后峰值</w:t>
       </w:r>
     </w:p>
     <w:p>
@@ -11387,7 +12016,7 @@
           <w:color w:val="1F2937"/>
           <w:sz w:val="18"/>
         </w:rPr>
-        <w:t xml:space="preserve">  → 收集板端验证报告</w:t>
+        <w:t xml:space="preserve">  → 循环推理 N 次 → 记录内存曲线</w:t>
       </w:r>
     </w:p>
     <w:p>
@@ -11401,7 +12030,7 @@
           <w:color w:val="1F2937"/>
           <w:sz w:val="18"/>
         </w:rPr>
-        <w:t xml:space="preserve">  → 生成模型版本说明</w:t>
+        <w:t xml:space="preserve">  → 释放模型 → 记录释放后内存</w:t>
       </w:r>
     </w:p>
     <w:p>
@@ -11415,7 +12044,160 @@
           <w:color w:val="1F2937"/>
           <w:sz w:val="18"/>
         </w:rPr>
-        <w:t xml:space="preserve">  → 生成 readme.txt / release note</w:t>
+        <w:t xml:space="preserve">  → 判定：释放后未回基线±阈值 / 曲线单调增长 / 峰值超限 → 不通过</w:t>
+      </w:r>
+    </w:p>
+    <w:p>
+      <w:r>
+        <w:rPr>
+          <w:rFonts w:ascii="微软雅黑" w:hAnsi="微软雅黑" w:eastAsia="微软雅黑"/>
+          <w:sz w:val="21"/>
+        </w:rPr>
+        <w:t>人工干预点：内存检查失败</w:t>
+      </w:r>
+    </w:p>
+    <w:p>
+      <w:r>
+        <w:rPr>
+          <w:rFonts w:ascii="微软雅黑" w:hAnsi="微软雅黑" w:eastAsia="微软雅黑"/>
+          <w:sz w:val="21"/>
+        </w:rPr>
+        <w:t>触发条件：</w:t>
+      </w:r>
+    </w:p>
+    <w:p>
+      <w:pPr>
+        <w:pStyle w:val="ListBullet"/>
+      </w:pPr>
+      <w:r>
+        <w:rPr>
+          <w:rFonts w:ascii="微软雅黑" w:hAnsi="微软雅黑" w:eastAsia="微软雅黑"/>
+          <w:sz w:val="21"/>
+        </w:rPr>
+        <w:t>内存泄漏</w:t>
+      </w:r>
+    </w:p>
+    <w:p>
+      <w:pPr>
+        <w:pStyle w:val="ListBullet"/>
+      </w:pPr>
+      <w:r>
+        <w:rPr>
+          <w:rFonts w:ascii="微软雅黑" w:hAnsi="微软雅黑" w:eastAsia="微软雅黑"/>
+          <w:sz w:val="21"/>
+        </w:rPr>
+        <w:t>峰值超限</w:t>
+      </w:r>
+    </w:p>
+    <w:p>
+      <w:pPr>
+        <w:pStyle w:val="ListBullet"/>
+      </w:pPr>
+      <w:r>
+        <w:rPr>
+          <w:rFonts w:ascii="微软雅黑" w:hAnsi="微软雅黑" w:eastAsia="微软雅黑"/>
+          <w:sz w:val="21"/>
+        </w:rPr>
+        <w:t>板端 crash</w:t>
+      </w:r>
+    </w:p>
+    <w:p>
+      <w:pPr>
+        <w:pStyle w:val="ListBullet"/>
+      </w:pPr>
+      <w:r>
+        <w:rPr>
+          <w:rFonts w:ascii="微软雅黑" w:hAnsi="微软雅黑" w:eastAsia="微软雅黑"/>
+          <w:sz w:val="21"/>
+        </w:rPr>
+        <w:t>长稳测试失败</w:t>
+      </w:r>
+    </w:p>
+    <w:p>
+      <w:r>
+        <w:rPr>
+          <w:rFonts w:ascii="微软雅黑" w:hAnsi="微软雅黑" w:eastAsia="微软雅黑"/>
+          <w:sz w:val="21"/>
+        </w:rPr>
+        <w:t>人工角色：软件/嵌入式负责人</w:t>
+      </w:r>
+    </w:p>
+    <w:p>
+      <w:r>
+        <w:rPr>
+          <w:rFonts w:ascii="微软雅黑" w:hAnsi="微软雅黑" w:eastAsia="微软雅黑"/>
+          <w:sz w:val="21"/>
+        </w:rPr>
+        <w:t>人工处理：</w:t>
+      </w:r>
+    </w:p>
+    <w:p>
+      <w:pPr>
+        <w:pStyle w:val="ListBullet"/>
+      </w:pPr>
+      <w:r>
+        <w:rPr>
+          <w:rFonts w:ascii="微软雅黑" w:hAnsi="微软雅黑" w:eastAsia="微软雅黑"/>
+          <w:sz w:val="21"/>
+        </w:rPr>
+        <w:t>查 malloc/free</w:t>
+      </w:r>
+    </w:p>
+    <w:p>
+      <w:pPr>
+        <w:pStyle w:val="ListBullet"/>
+      </w:pPr>
+      <w:r>
+        <w:rPr>
+          <w:rFonts w:ascii="微软雅黑" w:hAnsi="微软雅黑" w:eastAsia="微软雅黑"/>
+          <w:sz w:val="21"/>
+        </w:rPr>
+        <w:t>查 buffer 生命周期</w:t>
+      </w:r>
+    </w:p>
+    <w:p>
+      <w:pPr>
+        <w:pStyle w:val="ListBullet"/>
+      </w:pPr>
+      <w:r>
+        <w:rPr>
+          <w:rFonts w:ascii="微软雅黑" w:hAnsi="微软雅黑" w:eastAsia="微软雅黑"/>
+          <w:sz w:val="21"/>
+        </w:rPr>
+        <w:t>查模型加载/释放接口</w:t>
+      </w:r>
+    </w:p>
+    <w:p>
+      <w:pPr>
+        <w:pStyle w:val="ListBullet"/>
+      </w:pPr>
+      <w:r>
+        <w:rPr>
+          <w:rFonts w:ascii="微软雅黑" w:hAnsi="微软雅黑" w:eastAsia="微软雅黑"/>
+          <w:sz w:val="21"/>
+        </w:rPr>
+        <w:t>查异常路径资源释放</w:t>
+      </w:r>
+    </w:p>
+    <w:p>
+      <w:pPr>
+        <w:pStyle w:val="ListBullet"/>
+      </w:pPr>
+      <w:r>
+        <w:rPr>
+          <w:rFonts w:ascii="微软雅黑" w:hAnsi="微软雅黑" w:eastAsia="微软雅黑"/>
+          <w:sz w:val="21"/>
+        </w:rPr>
+        <w:t>查 NPU runtime 内存池</w:t>
+      </w:r>
+    </w:p>
+    <w:p>
+      <w:r>
+        <w:rPr>
+          <w:rFonts w:ascii="微软雅黑" w:hAnsi="微软雅黑" w:eastAsia="微软雅黑"/>
+          <w:sz w:val="21"/>
+        </w:rPr>
+        <w:t>处理完成后的回路（按分支）：</w:t>
       </w:r>
     </w:p>
     <w:p>
@@ -11429,7 +12211,540 @@
           <w:color w:val="1F2937"/>
           <w:sz w:val="18"/>
         </w:rPr>
-        <w:t xml:space="preserve">  → 生成内部候选包</w:t>
+        <w:t>分支 B（改过代码）：修代码 → 回第 5 节 Step B2 重新编译 → 重新部署 → 重新跑本节验证</w:t>
+      </w:r>
+    </w:p>
+    <w:p>
+      <w:pPr>
+        <w:spacing w:after="0" w:before="0"/>
+        <w:ind w:left="320"/>
+      </w:pPr>
+      <w:r>
+        <w:rPr>
+          <w:rFonts w:ascii="Consolas" w:hAnsi="Consolas" w:eastAsia="微软雅黑"/>
+          <w:color w:val="1F2937"/>
+          <w:sz w:val="18"/>
+        </w:rPr>
+        <w:t>分支 A（只换模型）：若泄漏由模型引起（如模型过大、加载接口不兼容）→ 回平台转换环节调整；</w:t>
+      </w:r>
+    </w:p>
+    <w:p>
+      <w:pPr>
+        <w:spacing w:after="0" w:before="0"/>
+        <w:ind w:left="320"/>
+      </w:pPr>
+      <w:r>
+        <w:rPr>
+          <w:rFonts w:ascii="Consolas" w:hAnsi="Consolas" w:eastAsia="微软雅黑"/>
+          <w:color w:val="1F2937"/>
+          <w:sz w:val="18"/>
+        </w:rPr>
+        <w:t xml:space="preserve">                  若确认是存量代码问题 → 转分支 B 流程修代码</w:t>
+      </w:r>
+    </w:p>
+    <w:p>
+      <w:pPr>
+        <w:pStyle w:val="Heading3"/>
+      </w:pPr>
+      <w:r>
+        <w:rPr>
+          <w:rFonts w:ascii="微软雅黑" w:hAnsi="微软雅黑" w:eastAsia="微软雅黑"/>
+          <w:b/>
+          <w:color w:val="334155"/>
+          <w:sz w:val="26"/>
+        </w:rPr>
+        <w:t>6.6 板端验证报告</w:t>
+      </w:r>
+    </w:p>
+    <w:p>
+      <w:pPr>
+        <w:pStyle w:val="ListBullet"/>
+      </w:pPr>
+      <w:r>
+        <w:rPr>
+          <w:rFonts w:ascii="微软雅黑" w:hAnsi="微软雅黑" w:eastAsia="微软雅黑"/>
+          <w:sz w:val="21"/>
+        </w:rPr>
+        <w:t>板端驱动版本</w:t>
+      </w:r>
+    </w:p>
+    <w:p>
+      <w:pPr>
+        <w:pStyle w:val="ListBullet"/>
+      </w:pPr>
+      <w:r>
+        <w:rPr>
+          <w:rFonts w:ascii="微软雅黑" w:hAnsi="微软雅黑" w:eastAsia="微软雅黑"/>
+          <w:sz w:val="21"/>
+        </w:rPr>
+        <w:t>代码、模型文件版本（含分支 A/B 标识）</w:t>
+      </w:r>
+    </w:p>
+    <w:p>
+      <w:pPr>
+        <w:pStyle w:val="ListBullet"/>
+      </w:pPr>
+      <w:r>
+        <w:rPr>
+          <w:rFonts w:ascii="微软雅黑" w:hAnsi="微软雅黑" w:eastAsia="微软雅黑"/>
+          <w:sz w:val="21"/>
+        </w:rPr>
+        <w:t>测试集版本</w:t>
+      </w:r>
+    </w:p>
+    <w:p>
+      <w:pPr>
+        <w:pStyle w:val="ListBullet"/>
+      </w:pPr>
+      <w:r>
+        <w:rPr>
+          <w:rFonts w:ascii="微软雅黑" w:hAnsi="微软雅黑" w:eastAsia="微软雅黑"/>
+          <w:sz w:val="21"/>
+        </w:rPr>
+        <w:t>新旧结果对比</w:t>
+      </w:r>
+    </w:p>
+    <w:p>
+      <w:pPr>
+        <w:pStyle w:val="ListBullet"/>
+      </w:pPr>
+      <w:r>
+        <w:rPr>
+          <w:rFonts w:ascii="微软雅黑" w:hAnsi="微软雅黑" w:eastAsia="微软雅黑"/>
+          <w:sz w:val="21"/>
+        </w:rPr>
+        <w:t>与基准结果对比</w:t>
+      </w:r>
+    </w:p>
+    <w:p>
+      <w:pPr>
+        <w:pStyle w:val="ListBullet"/>
+      </w:pPr>
+      <w:r>
+        <w:rPr>
+          <w:rFonts w:ascii="微软雅黑" w:hAnsi="微软雅黑" w:eastAsia="微软雅黑"/>
+          <w:sz w:val="21"/>
+        </w:rPr>
+        <w:t>与仿真结果对比</w:t>
+      </w:r>
+    </w:p>
+    <w:p>
+      <w:pPr>
+        <w:pStyle w:val="ListBullet"/>
+      </w:pPr>
+      <w:r>
+        <w:rPr>
+          <w:rFonts w:ascii="微软雅黑" w:hAnsi="微软雅黑" w:eastAsia="微软雅黑"/>
+          <w:sz w:val="21"/>
+        </w:rPr>
+        <w:t>性能指标</w:t>
+      </w:r>
+    </w:p>
+    <w:p>
+      <w:pPr>
+        <w:pStyle w:val="ListBullet"/>
+      </w:pPr>
+      <w:r>
+        <w:rPr>
+          <w:rFonts w:ascii="微软雅黑" w:hAnsi="微软雅黑" w:eastAsia="微软雅黑"/>
+          <w:sz w:val="21"/>
+        </w:rPr>
+        <w:t>内存检查结果</w:t>
+      </w:r>
+    </w:p>
+    <w:p>
+      <w:pPr>
+        <w:pStyle w:val="ListBullet"/>
+      </w:pPr>
+      <w:r>
+        <w:rPr>
+          <w:rFonts w:ascii="微软雅黑" w:hAnsi="微软雅黑" w:eastAsia="微软雅黑"/>
+          <w:sz w:val="21"/>
+        </w:rPr>
+        <w:t>是否通过门禁</w:t>
+      </w:r>
+    </w:p>
+    <w:p>
+      <w:pPr>
+        <w:pStyle w:val="ListBullet"/>
+      </w:pPr>
+      <w:r>
+        <w:rPr>
+          <w:rFonts w:ascii="微软雅黑" w:hAnsi="微软雅黑" w:eastAsia="微软雅黑"/>
+          <w:sz w:val="21"/>
+        </w:rPr>
+        <w:t>未通过原因分类</w:t>
+      </w:r>
+    </w:p>
+    <w:p>
+      <w:pPr>
+        <w:pStyle w:val="ListBullet"/>
+      </w:pPr>
+      <w:r>
+        <w:rPr>
+          <w:rFonts w:ascii="微软雅黑" w:hAnsi="微软雅黑" w:eastAsia="微软雅黑"/>
+          <w:sz w:val="21"/>
+        </w:rPr>
+        <w:t>建议下一步动作</w:t>
+      </w:r>
+    </w:p>
+    <w:p>
+      <w:r>
+        <w:rPr>
+          <w:rFonts w:ascii="微软雅黑" w:hAnsi="微软雅黑" w:eastAsia="微软雅黑"/>
+          <w:sz w:val="21"/>
+        </w:rPr>
+        <w:t>验证全部通过 → 进入第四部分交付。</w:t>
+      </w:r>
+    </w:p>
+    <w:p>
+      <w:pPr>
+        <w:pStyle w:val="Heading1"/>
+      </w:pPr>
+      <w:r>
+        <w:rPr>
+          <w:rFonts w:ascii="微软雅黑" w:hAnsi="微软雅黑" w:eastAsia="微软雅黑"/>
+          <w:b/>
+          <w:color w:val="1E3A5F"/>
+          <w:sz w:val="36"/>
+        </w:rPr>
+        <w:t>四、交付</w:t>
+      </w:r>
+    </w:p>
+    <w:p>
+      <w:pPr>
+        <w:spacing w:after="0" w:before="0"/>
+        <w:ind w:left="320"/>
+      </w:pPr>
+      <w:r>
+        <w:rPr>
+          <w:rFonts w:ascii="Consolas" w:hAnsi="Consolas" w:eastAsia="微软雅黑"/>
+          <w:color w:val="1F2937"/>
+          <w:sz w:val="18"/>
+        </w:rPr>
+        <w:t>板端验证通过</w:t>
+      </w:r>
+    </w:p>
+    <w:p>
+      <w:pPr>
+        <w:spacing w:after="0" w:before="0"/>
+        <w:ind w:left="320"/>
+      </w:pPr>
+      <w:r>
+        <w:rPr>
+          <w:rFonts w:ascii="Consolas" w:hAnsi="Consolas" w:eastAsia="微软雅黑"/>
+          <w:color w:val="1F2937"/>
+          <w:sz w:val="18"/>
+        </w:rPr>
+        <w:t xml:space="preserve">  ↓</w:t>
+      </w:r>
+    </w:p>
+    <w:p>
+      <w:pPr>
+        <w:spacing w:after="0" w:before="0"/>
+        <w:ind w:left="320"/>
+      </w:pPr>
+      <w:r>
+        <w:rPr>
+          <w:rFonts w:ascii="Consolas" w:hAnsi="Consolas" w:eastAsia="微软雅黑"/>
+          <w:color w:val="1F2937"/>
+          <w:sz w:val="18"/>
+        </w:rPr>
+        <w:t>生成内部候选 release 包</w:t>
+      </w:r>
+    </w:p>
+    <w:p>
+      <w:pPr>
+        <w:spacing w:after="0" w:before="0"/>
+        <w:ind w:left="320"/>
+      </w:pPr>
+      <w:r>
+        <w:rPr>
+          <w:rFonts w:ascii="Consolas" w:hAnsi="Consolas" w:eastAsia="微软雅黑"/>
+          <w:color w:val="1F2937"/>
+          <w:sz w:val="18"/>
+        </w:rPr>
+        <w:t xml:space="preserve">  ↓</w:t>
+      </w:r>
+    </w:p>
+    <w:p>
+      <w:pPr>
+        <w:spacing w:after="0" w:before="0"/>
+        <w:ind w:left="320"/>
+      </w:pPr>
+      <w:r>
+        <w:rPr>
+          <w:rFonts w:ascii="Consolas" w:hAnsi="Consolas" w:eastAsia="微软雅黑"/>
+          <w:color w:val="1F2937"/>
+          <w:sz w:val="18"/>
+        </w:rPr>
+        <w:t>自动生成 readme.txt / doc / release note</w:t>
+      </w:r>
+    </w:p>
+    <w:p>
+      <w:pPr>
+        <w:spacing w:after="0" w:before="0"/>
+        <w:ind w:left="320"/>
+      </w:pPr>
+      <w:r>
+        <w:rPr>
+          <w:rFonts w:ascii="Consolas" w:hAnsi="Consolas" w:eastAsia="微软雅黑"/>
+          <w:color w:val="1F2937"/>
+          <w:sz w:val="18"/>
+        </w:rPr>
+        <w:t xml:space="preserve">  ↓</w:t>
+      </w:r>
+    </w:p>
+    <w:p>
+      <w:pPr>
+        <w:spacing w:after="0" w:before="0"/>
+        <w:ind w:left="320"/>
+      </w:pPr>
+      <w:r>
+        <w:rPr>
+          <w:rFonts w:ascii="Consolas" w:hAnsi="Consolas" w:eastAsia="微软雅黑"/>
+          <w:color w:val="1F2937"/>
+          <w:sz w:val="18"/>
+        </w:rPr>
+        <w:t>准备 Gerrit 提交材料</w:t>
+      </w:r>
+    </w:p>
+    <w:p>
+      <w:pPr>
+        <w:spacing w:after="0" w:before="0"/>
+        <w:ind w:left="320"/>
+      </w:pPr>
+      <w:r>
+        <w:rPr>
+          <w:rFonts w:ascii="Consolas" w:hAnsi="Consolas" w:eastAsia="微软雅黑"/>
+          <w:color w:val="1F2937"/>
+          <w:sz w:val="18"/>
+        </w:rPr>
+        <w:t xml:space="preserve">  ↓</w:t>
+      </w:r>
+    </w:p>
+    <w:p>
+      <w:pPr>
+        <w:spacing w:after="0" w:before="0"/>
+        <w:ind w:left="320"/>
+      </w:pPr>
+      <w:r>
+        <w:rPr>
+          <w:rFonts w:ascii="Consolas" w:hAnsi="Consolas" w:eastAsia="微软雅黑"/>
+          <w:color w:val="1F2937"/>
+          <w:sz w:val="18"/>
+        </w:rPr>
+        <w:t>人工审批</w:t>
+      </w:r>
+    </w:p>
+    <w:p>
+      <w:pPr>
+        <w:spacing w:after="0" w:before="0"/>
+        <w:ind w:left="320"/>
+      </w:pPr>
+      <w:r>
+        <w:rPr>
+          <w:rFonts w:ascii="Consolas" w:hAnsi="Consolas" w:eastAsia="微软雅黑"/>
+          <w:color w:val="1F2937"/>
+          <w:sz w:val="18"/>
+        </w:rPr>
+        <w:t xml:space="preserve">  ↓</w:t>
+      </w:r>
+    </w:p>
+    <w:p>
+      <w:pPr>
+        <w:spacing w:after="0" w:before="0"/>
+        <w:ind w:left="320"/>
+      </w:pPr>
+      <w:r>
+        <w:rPr>
+          <w:rFonts w:ascii="Consolas" w:hAnsi="Consolas" w:eastAsia="微软雅黑"/>
+          <w:color w:val="1F2937"/>
+          <w:sz w:val="18"/>
+        </w:rPr>
+        <w:t>提交/合入 Gerrit（若涉及代码）</w:t>
+      </w:r>
+    </w:p>
+    <w:p>
+      <w:pPr>
+        <w:spacing w:after="0" w:before="0"/>
+        <w:ind w:left="320"/>
+      </w:pPr>
+      <w:r>
+        <w:rPr>
+          <w:rFonts w:ascii="Consolas" w:hAnsi="Consolas" w:eastAsia="微软雅黑"/>
+          <w:color w:val="1F2937"/>
+          <w:sz w:val="18"/>
+        </w:rPr>
+        <w:t xml:space="preserve">  ↓</w:t>
+      </w:r>
+    </w:p>
+    <w:p>
+      <w:pPr>
+        <w:spacing w:after="0" w:before="0"/>
+        <w:ind w:left="320"/>
+      </w:pPr>
+      <w:r>
+        <w:rPr>
+          <w:rFonts w:ascii="Consolas" w:hAnsi="Consolas" w:eastAsia="微软雅黑"/>
+          <w:color w:val="1F2937"/>
+          <w:sz w:val="18"/>
+        </w:rPr>
+        <w:t>归档版本与测试报告</w:t>
+      </w:r>
+    </w:p>
+    <w:p>
+      <w:pPr>
+        <w:spacing w:after="0" w:before="0"/>
+        <w:ind w:left="320"/>
+      </w:pPr>
+      <w:r>
+        <w:rPr>
+          <w:rFonts w:ascii="Consolas" w:hAnsi="Consolas" w:eastAsia="微软雅黑"/>
+          <w:color w:val="1F2937"/>
+          <w:sz w:val="18"/>
+        </w:rPr>
+        <w:t xml:space="preserve">  ↓</w:t>
+      </w:r>
+    </w:p>
+    <w:p>
+      <w:pPr>
+        <w:spacing w:after="0" w:before="0"/>
+        <w:ind w:left="320"/>
+      </w:pPr>
+      <w:r>
+        <w:rPr>
+          <w:rFonts w:ascii="Consolas" w:hAnsi="Consolas" w:eastAsia="微软雅黑"/>
+          <w:color w:val="1F2937"/>
+          <w:sz w:val="18"/>
+        </w:rPr>
+        <w:t>进入客户同步流程</w:t>
+      </w:r>
+    </w:p>
+    <w:p>
+      <w:pPr>
+        <w:spacing w:after="0" w:before="0"/>
+        <w:ind w:left="320"/>
+      </w:pPr>
+      <w:r>
+        <w:rPr>
+          <w:rFonts w:ascii="Consolas" w:hAnsi="Consolas" w:eastAsia="微软雅黑"/>
+          <w:color w:val="1F2937"/>
+          <w:sz w:val="18"/>
+        </w:rPr>
+        <w:t xml:space="preserve">  ↓</w:t>
+      </w:r>
+    </w:p>
+    <w:p>
+      <w:pPr>
+        <w:spacing w:after="0" w:before="0"/>
+        <w:ind w:left="320"/>
+      </w:pPr>
+      <w:r>
+        <w:rPr>
+          <w:rFonts w:ascii="Consolas" w:hAnsi="Consolas" w:eastAsia="微软雅黑"/>
+          <w:color w:val="1F2937"/>
+          <w:sz w:val="18"/>
+        </w:rPr>
+        <w:t>客户确认解决/未解决 → 回写 case 库</w:t>
+      </w:r>
+    </w:p>
+    <w:p>
+      <w:pPr>
+        <w:pStyle w:val="Heading2"/>
+      </w:pPr>
+      <w:r>
+        <w:rPr>
+          <w:rFonts w:ascii="微软雅黑" w:hAnsi="微软雅黑" w:eastAsia="微软雅黑"/>
+          <w:b/>
+          <w:color w:val="1E40AF"/>
+          <w:sz w:val="30"/>
+        </w:rPr>
+        <w:t>1. 自动准备内容</w:t>
+      </w:r>
+    </w:p>
+    <w:p>
+      <w:pPr>
+        <w:pStyle w:val="ListBullet"/>
+      </w:pPr>
+      <w:r>
+        <w:rPr>
+          <w:rFonts w:ascii="微软雅黑" w:hAnsi="微软雅黑" w:eastAsia="微软雅黑"/>
+          <w:sz w:val="21"/>
+        </w:rPr>
+        <w:t>代码 diff（如有）</w:t>
+      </w:r>
+    </w:p>
+    <w:p>
+      <w:pPr>
+        <w:pStyle w:val="ListBullet"/>
+      </w:pPr>
+      <w:r>
+        <w:rPr>
+          <w:rFonts w:ascii="微软雅黑" w:hAnsi="微软雅黑" w:eastAsia="微软雅黑"/>
+          <w:sz w:val="21"/>
+        </w:rPr>
+        <w:t>内存检查报告</w:t>
+      </w:r>
+    </w:p>
+    <w:p>
+      <w:pPr>
+        <w:pStyle w:val="ListBullet"/>
+      </w:pPr>
+      <w:r>
+        <w:rPr>
+          <w:rFonts w:ascii="微软雅黑" w:hAnsi="微软雅黑" w:eastAsia="微软雅黑"/>
+          <w:sz w:val="21"/>
+        </w:rPr>
+        <w:t>板端测试报告</w:t>
+      </w:r>
+    </w:p>
+    <w:p>
+      <w:pPr>
+        <w:pStyle w:val="ListBullet"/>
+      </w:pPr>
+      <w:r>
+        <w:rPr>
+          <w:rFonts w:ascii="微软雅黑" w:hAnsi="微软雅黑" w:eastAsia="微软雅黑"/>
+          <w:sz w:val="21"/>
+        </w:rPr>
+        <w:t>模型版本信息</w:t>
+      </w:r>
+    </w:p>
+    <w:p>
+      <w:pPr>
+        <w:pStyle w:val="ListBullet"/>
+      </w:pPr>
+      <w:r>
+        <w:rPr>
+          <w:rFonts w:ascii="微软雅黑" w:hAnsi="微软雅黑" w:eastAsia="微软雅黑"/>
+          <w:sz w:val="21"/>
+        </w:rPr>
+        <w:t>readme.txt</w:t>
+      </w:r>
+    </w:p>
+    <w:p>
+      <w:pPr>
+        <w:pStyle w:val="ListBullet"/>
+      </w:pPr>
+      <w:r>
+        <w:rPr>
+          <w:rFonts w:ascii="微软雅黑" w:hAnsi="微软雅黑" w:eastAsia="微软雅黑"/>
+          <w:sz w:val="21"/>
+        </w:rPr>
+        <w:t>doc</w:t>
+      </w:r>
+    </w:p>
+    <w:p>
+      <w:pPr>
+        <w:pStyle w:val="ListBullet"/>
+      </w:pPr>
+      <w:r>
+        <w:rPr>
+          <w:rFonts w:ascii="微软雅黑" w:hAnsi="微软雅黑" w:eastAsia="微软雅黑"/>
+          <w:sz w:val="21"/>
+        </w:rPr>
+        <w:t>release note</w:t>
       </w:r>
     </w:p>
     <w:p>
@@ -11512,7 +12827,7 @@
                 <w:rFonts w:ascii="微软雅黑" w:hAnsi="微软雅黑" w:eastAsia="微软雅黑"/>
                 <w:sz w:val="18"/>
               </w:rPr>
-              <w:t>V821/V861/V853 对应格式</w:t>
+              <w:t>V821/V861/V853 对应格式（含 .c/.h、加密模型等平台产物）</w:t>
             </w:r>
           </w:p>
         </w:tc>
@@ -11561,7 +12876,7 @@
                 <w:rFonts w:ascii="微软雅黑" w:hAnsi="微软雅黑" w:eastAsia="微软雅黑"/>
                 <w:sz w:val="18"/>
               </w:rPr>
-              <w:t>测试报告</w:t>
+              <w:t>可执行程序</w:t>
             </w:r>
           </w:p>
         </w:tc>
@@ -11576,7 +12891,7 @@
                 <w:rFonts w:ascii="微软雅黑" w:hAnsi="微软雅黑" w:eastAsia="微软雅黑"/>
                 <w:sz w:val="18"/>
               </w:rPr>
-              <w:t>badcase / 回归 / 专业测试集</w:t>
+              <w:t>仅分支 B（代码有修改时）</w:t>
             </w:r>
           </w:p>
         </w:tc>
@@ -11593,7 +12908,7 @@
                 <w:rFonts w:ascii="微软雅黑" w:hAnsi="微软雅黑" w:eastAsia="微软雅黑"/>
                 <w:sz w:val="18"/>
               </w:rPr>
-              <w:t>文档</w:t>
+              <w:t>测试报告</w:t>
             </w:r>
           </w:p>
         </w:tc>
@@ -11608,7 +12923,7 @@
                 <w:rFonts w:ascii="微软雅黑" w:hAnsi="微软雅黑" w:eastAsia="微软雅黑"/>
                 <w:sz w:val="18"/>
               </w:rPr>
-              <w:t>readme.txt、变更说明、使用说明</w:t>
+              <w:t>badcase / 回归 / 专业测试集 / 内存检查</w:t>
             </w:r>
           </w:p>
         </w:tc>
@@ -11625,6 +12940,38 @@
                 <w:rFonts w:ascii="微软雅黑" w:hAnsi="微软雅黑" w:eastAsia="微软雅黑"/>
                 <w:sz w:val="18"/>
               </w:rPr>
+              <w:t>文档</w:t>
+            </w:r>
+          </w:p>
+        </w:tc>
+        <w:tc>
+          <w:tcPr>
+            <w:tcW w:type="dxa" w:w="4320"/>
+          </w:tcPr>
+          <w:p>
+            <w:r/>
+            <w:r>
+              <w:rPr>
+                <w:rFonts w:ascii="微软雅黑" w:hAnsi="微软雅黑" w:eastAsia="微软雅黑"/>
+                <w:sz w:val="18"/>
+              </w:rPr>
+              <w:t>readme.txt、变更说明、使用说明</w:t>
+            </w:r>
+          </w:p>
+        </w:tc>
+      </w:tr>
+      <w:tr>
+        <w:tc>
+          <w:tcPr>
+            <w:tcW w:type="dxa" w:w="4320"/>
+          </w:tcPr>
+          <w:p>
+            <w:r/>
+            <w:r>
+              <w:rPr>
+                <w:rFonts w:ascii="微软雅黑" w:hAnsi="微软雅黑" w:eastAsia="微软雅黑"/>
+                <w:sz w:val="18"/>
+              </w:rPr>
               <w:t>版本记录</w:t>
             </w:r>
           </w:p>
@@ -11640,7 +12987,7 @@
                 <w:rFonts w:ascii="微软雅黑" w:hAnsi="微软雅黑" w:eastAsia="微软雅黑"/>
                 <w:sz w:val="18"/>
               </w:rPr>
-              <w:t>模型版本、数据版本、训练任务、转换工具版本</w:t>
+              <w:t>模型版本、数据版本、训练任务、转换工具版本、代码 commit</w:t>
             </w:r>
           </w:p>
         </w:tc>
@@ -11653,7 +13000,7 @@
           <w:rFonts w:ascii="微软雅黑" w:hAnsi="微软雅黑" w:eastAsia="微软雅黑"/>
           <w:sz w:val="21"/>
         </w:rPr>
-        <w:t>人工审批：</w:t>
+        <w:t>人工审批（双负责人）：</w:t>
       </w:r>
     </w:p>
     <w:p>
@@ -11719,7 +13066,7 @@
           <w:rFonts w:ascii="微软雅黑" w:hAnsi="微软雅黑" w:eastAsia="微软雅黑"/>
           <w:sz w:val="21"/>
         </w:rPr>
-        <w:t>是否可以直接替换模型</w:t>
+        <w:t>是否可以直接替换模型（分支 A）/ 代码变更是否可合入（分支 B）</w:t>
       </w:r>
     </w:p>
     <w:p>
@@ -11731,730 +13078,7 @@
           <w:rFonts w:ascii="微软雅黑" w:hAnsi="微软雅黑" w:eastAsia="微软雅黑"/>
           <w:sz w:val="21"/>
         </w:rPr>
-        <w:t>是否无需代码修改</w:t>
-      </w:r>
-    </w:p>
-    <w:p>
-      <w:pPr>
-        <w:pStyle w:val="ListBullet"/>
-      </w:pPr>
-      <w:r>
-        <w:rPr>
-          <w:rFonts w:ascii="微软雅黑" w:hAnsi="微软雅黑" w:eastAsia="微软雅黑"/>
-          <w:sz w:val="21"/>
-        </w:rPr>
         <w:t>版本兼容性是否 OK</w:t>
-      </w:r>
-    </w:p>
-    <w:p>
-      <w:pPr>
-        <w:pStyle w:val="Heading3"/>
-      </w:pPr>
-      <w:r>
-        <w:rPr>
-          <w:rFonts w:ascii="微软雅黑" w:hAnsi="微软雅黑" w:eastAsia="微软雅黑"/>
-          <w:b/>
-          <w:color w:val="334155"/>
-          <w:sz w:val="26"/>
-        </w:rPr>
-        <w:t>6.3 分支 B：涉及代码修改</w:t>
-      </w:r>
-    </w:p>
-    <w:p>
-      <w:pPr>
-        <w:pStyle w:val="Heading4"/>
-      </w:pPr>
-      <w:r>
-        <w:rPr>
-          <w:rFonts w:ascii="微软雅黑" w:hAnsi="微软雅黑" w:eastAsia="微软雅黑"/>
-          <w:b/>
-          <w:color w:val="475569"/>
-          <w:sz w:val="24"/>
-        </w:rPr>
-        <w:t>Step B1：代码整理</w:t>
-      </w:r>
-    </w:p>
-    <w:p>
-      <w:r>
-        <w:rPr>
-          <w:rFonts w:ascii="微软雅黑" w:hAnsi="微软雅黑" w:eastAsia="微软雅黑"/>
-          <w:sz w:val="21"/>
-        </w:rPr>
-        <w:t>自动辅助检查：</w:t>
-      </w:r>
-    </w:p>
-    <w:p>
-      <w:pPr>
-        <w:pStyle w:val="ListBullet"/>
-      </w:pPr>
-      <w:r>
-        <w:rPr>
-          <w:rFonts w:ascii="微软雅黑" w:hAnsi="微软雅黑" w:eastAsia="微软雅黑"/>
-          <w:sz w:val="21"/>
-        </w:rPr>
-        <w:t>代码格式化</w:t>
-      </w:r>
-    </w:p>
-    <w:p>
-      <w:pPr>
-        <w:pStyle w:val="ListBullet"/>
-      </w:pPr>
-      <w:r>
-        <w:rPr>
-          <w:rFonts w:ascii="微软雅黑" w:hAnsi="微软雅黑" w:eastAsia="微软雅黑"/>
-          <w:sz w:val="21"/>
-        </w:rPr>
-        <w:t>无调试日志残留</w:t>
-      </w:r>
-    </w:p>
-    <w:p>
-      <w:pPr>
-        <w:pStyle w:val="ListBullet"/>
-      </w:pPr>
-      <w:r>
-        <w:rPr>
-          <w:rFonts w:ascii="微软雅黑" w:hAnsi="微软雅黑" w:eastAsia="微软雅黑"/>
-          <w:sz w:val="21"/>
-        </w:rPr>
-        <w:t>无硬编码临时路径</w:t>
-      </w:r>
-    </w:p>
-    <w:p>
-      <w:pPr>
-        <w:pStyle w:val="ListBullet"/>
-      </w:pPr>
-      <w:r>
-        <w:rPr>
-          <w:rFonts w:ascii="微软雅黑" w:hAnsi="微软雅黑" w:eastAsia="微软雅黑"/>
-          <w:sz w:val="21"/>
-        </w:rPr>
-        <w:t>无测试开关残留</w:t>
-      </w:r>
-    </w:p>
-    <w:p>
-      <w:pPr>
-        <w:pStyle w:val="ListBullet"/>
-      </w:pPr>
-      <w:r>
-        <w:rPr>
-          <w:rFonts w:ascii="微软雅黑" w:hAnsi="微软雅黑" w:eastAsia="微软雅黑"/>
-          <w:sz w:val="21"/>
-        </w:rPr>
-        <w:t>配置项有默认值</w:t>
-      </w:r>
-    </w:p>
-    <w:p>
-      <w:pPr>
-        <w:pStyle w:val="ListBullet"/>
-      </w:pPr>
-      <w:r>
-        <w:rPr>
-          <w:rFonts w:ascii="微软雅黑" w:hAnsi="微软雅黑" w:eastAsia="微软雅黑"/>
-          <w:sz w:val="21"/>
-        </w:rPr>
-        <w:t>错误处理完整</w:t>
-      </w:r>
-    </w:p>
-    <w:p>
-      <w:pPr>
-        <w:pStyle w:val="ListBullet"/>
-      </w:pPr>
-      <w:r>
-        <w:rPr>
-          <w:rFonts w:ascii="微软雅黑" w:hAnsi="微软雅黑" w:eastAsia="微软雅黑"/>
-          <w:sz w:val="21"/>
-        </w:rPr>
-        <w:t>与模型版本/参数版本一致</w:t>
-      </w:r>
-    </w:p>
-    <w:p>
-      <w:r>
-        <w:rPr>
-          <w:rFonts w:ascii="微软雅黑" w:hAnsi="微软雅黑" w:eastAsia="微软雅黑"/>
-          <w:sz w:val="21"/>
-        </w:rPr>
-        <w:t>人工检查：</w:t>
-      </w:r>
-    </w:p>
-    <w:p>
-      <w:pPr>
-        <w:pStyle w:val="ListBullet"/>
-      </w:pPr>
-      <w:r>
-        <w:rPr>
-          <w:rFonts w:ascii="微软雅黑" w:hAnsi="微软雅黑" w:eastAsia="微软雅黑"/>
-          <w:sz w:val="21"/>
-        </w:rPr>
-        <w:t>代码逻辑是否正确</w:t>
-      </w:r>
-    </w:p>
-    <w:p>
-      <w:pPr>
-        <w:pStyle w:val="ListBullet"/>
-      </w:pPr>
-      <w:r>
-        <w:rPr>
-          <w:rFonts w:ascii="微软雅黑" w:hAnsi="微软雅黑" w:eastAsia="微软雅黑"/>
-          <w:sz w:val="21"/>
-        </w:rPr>
-        <w:t>main_backend 参数是否匹配</w:t>
-      </w:r>
-    </w:p>
-    <w:p>
-      <w:pPr>
-        <w:pStyle w:val="ListBullet"/>
-      </w:pPr>
-      <w:r>
-        <w:rPr>
-          <w:rFonts w:ascii="微软雅黑" w:hAnsi="微软雅黑" w:eastAsia="微软雅黑"/>
-          <w:sz w:val="21"/>
-        </w:rPr>
-        <w:t>前后处理逻辑是否与训练/转换配置一致</w:t>
-      </w:r>
-    </w:p>
-    <w:p>
-      <w:pPr>
-        <w:pStyle w:val="Heading4"/>
-      </w:pPr>
-      <w:r>
-        <w:rPr>
-          <w:rFonts w:ascii="微软雅黑" w:hAnsi="微软雅黑" w:eastAsia="微软雅黑"/>
-          <w:b/>
-          <w:color w:val="475569"/>
-          <w:sz w:val="24"/>
-        </w:rPr>
-        <w:t>Step B2：重新编译</w:t>
-      </w:r>
-    </w:p>
-    <w:p>
-      <w:r>
-        <w:rPr>
-          <w:rFonts w:ascii="微软雅黑" w:hAnsi="微软雅黑" w:eastAsia="微软雅黑"/>
-          <w:sz w:val="21"/>
-        </w:rPr>
-        <w:t>自动执行：</w:t>
-      </w:r>
-    </w:p>
-    <w:p>
-      <w:pPr>
-        <w:spacing w:after="0" w:before="0"/>
-        <w:ind w:left="320"/>
-      </w:pPr>
-      <w:r>
-        <w:rPr>
-          <w:rFonts w:ascii="Consolas" w:hAnsi="Consolas" w:eastAsia="微软雅黑"/>
-          <w:color w:val="1F2937"/>
-          <w:sz w:val="18"/>
-        </w:rPr>
-        <w:t>拉取指定代码分支</w:t>
-      </w:r>
-    </w:p>
-    <w:p>
-      <w:pPr>
-        <w:spacing w:after="0" w:before="0"/>
-        <w:ind w:left="320"/>
-      </w:pPr>
-      <w:r>
-        <w:rPr>
-          <w:rFonts w:ascii="Consolas" w:hAnsi="Consolas" w:eastAsia="微软雅黑"/>
-          <w:color w:val="1F2937"/>
-          <w:sz w:val="18"/>
-        </w:rPr>
-        <w:t xml:space="preserve">  ↓</w:t>
-      </w:r>
-    </w:p>
-    <w:p>
-      <w:pPr>
-        <w:spacing w:after="0" w:before="0"/>
-        <w:ind w:left="320"/>
-      </w:pPr>
-      <w:r>
-        <w:rPr>
-          <w:rFonts w:ascii="Consolas" w:hAnsi="Consolas" w:eastAsia="微软雅黑"/>
-          <w:color w:val="1F2937"/>
-          <w:sz w:val="18"/>
-        </w:rPr>
-        <w:t>应用本次修改</w:t>
-      </w:r>
-    </w:p>
-    <w:p>
-      <w:pPr>
-        <w:spacing w:after="0" w:before="0"/>
-        <w:ind w:left="320"/>
-      </w:pPr>
-      <w:r>
-        <w:rPr>
-          <w:rFonts w:ascii="Consolas" w:hAnsi="Consolas" w:eastAsia="微软雅黑"/>
-          <w:color w:val="1F2937"/>
-          <w:sz w:val="18"/>
-        </w:rPr>
-        <w:t xml:space="preserve">  ↓</w:t>
-      </w:r>
-    </w:p>
-    <w:p>
-      <w:pPr>
-        <w:spacing w:after="0" w:before="0"/>
-        <w:ind w:left="320"/>
-      </w:pPr>
-      <w:r>
-        <w:rPr>
-          <w:rFonts w:ascii="Consolas" w:hAnsi="Consolas" w:eastAsia="微软雅黑"/>
-          <w:color w:val="1F2937"/>
-          <w:sz w:val="18"/>
-        </w:rPr>
-        <w:t>编译</w:t>
-      </w:r>
-    </w:p>
-    <w:p>
-      <w:pPr>
-        <w:spacing w:after="0" w:before="0"/>
-        <w:ind w:left="320"/>
-      </w:pPr>
-      <w:r>
-        <w:rPr>
-          <w:rFonts w:ascii="Consolas" w:hAnsi="Consolas" w:eastAsia="微软雅黑"/>
-          <w:color w:val="1F2937"/>
-          <w:sz w:val="18"/>
-        </w:rPr>
-        <w:t xml:space="preserve">  ↓</w:t>
-      </w:r>
-    </w:p>
-    <w:p>
-      <w:pPr>
-        <w:spacing w:after="0" w:before="0"/>
-        <w:ind w:left="320"/>
-      </w:pPr>
-      <w:r>
-        <w:rPr>
-          <w:rFonts w:ascii="Consolas" w:hAnsi="Consolas" w:eastAsia="微软雅黑"/>
-          <w:color w:val="1F2937"/>
-          <w:sz w:val="18"/>
-        </w:rPr>
-        <w:t>生成可执行文件 / so / 固件组件</w:t>
-      </w:r>
-    </w:p>
-    <w:p>
-      <w:pPr>
-        <w:spacing w:after="0" w:before="0"/>
-        <w:ind w:left="320"/>
-      </w:pPr>
-      <w:r>
-        <w:rPr>
-          <w:rFonts w:ascii="Consolas" w:hAnsi="Consolas" w:eastAsia="微软雅黑"/>
-          <w:color w:val="1F2937"/>
-          <w:sz w:val="18"/>
-        </w:rPr>
-        <w:t xml:space="preserve">  ↓</w:t>
-      </w:r>
-    </w:p>
-    <w:p>
-      <w:pPr>
-        <w:spacing w:after="0" w:before="0"/>
-        <w:ind w:left="320"/>
-      </w:pPr>
-      <w:r>
-        <w:rPr>
-          <w:rFonts w:ascii="Consolas" w:hAnsi="Consolas" w:eastAsia="微软雅黑"/>
-          <w:color w:val="1F2937"/>
-          <w:sz w:val="18"/>
-        </w:rPr>
-        <w:t>记录编译日志</w:t>
-      </w:r>
-    </w:p>
-    <w:p>
-      <w:r>
-        <w:rPr>
-          <w:rFonts w:ascii="微软雅黑" w:hAnsi="微软雅黑" w:eastAsia="微软雅黑"/>
-          <w:sz w:val="21"/>
-        </w:rPr>
-        <w:t>失败时：</w:t>
-      </w:r>
-    </w:p>
-    <w:p>
-      <w:pPr>
-        <w:spacing w:after="0" w:before="0"/>
-        <w:ind w:left="320"/>
-      </w:pPr>
-      <w:r>
-        <w:rPr>
-          <w:rFonts w:ascii="Consolas" w:hAnsi="Consolas" w:eastAsia="微软雅黑"/>
-          <w:color w:val="1F2937"/>
-          <w:sz w:val="18"/>
-        </w:rPr>
-        <w:t>编译失败 → 自动归类错误 → 派给软件负责人 → 修复后重新编译</w:t>
-      </w:r>
-    </w:p>
-    <w:p>
-      <w:pPr>
-        <w:pStyle w:val="Heading4"/>
-      </w:pPr>
-      <w:r>
-        <w:rPr>
-          <w:rFonts w:ascii="微软雅黑" w:hAnsi="微软雅黑" w:eastAsia="微软雅黑"/>
-          <w:b/>
-          <w:color w:val="475569"/>
-          <w:sz w:val="24"/>
-        </w:rPr>
-        <w:t>Step B3：代码变更后的板端回归 + 内存检查</w:t>
-      </w:r>
-    </w:p>
-    <w:p>
-      <w:r>
-        <w:rPr>
-          <w:rFonts w:ascii="微软雅黑" w:hAnsi="微软雅黑" w:eastAsia="微软雅黑"/>
-          <w:sz w:val="21"/>
-        </w:rPr>
-        <w:t>代码修改后必须重新跑板端，不允许只看编译通过。通过后进入交付。</w:t>
-      </w:r>
-    </w:p>
-    <w:p>
-      <w:pPr>
-        <w:pStyle w:val="Heading1"/>
-      </w:pPr>
-      <w:r>
-        <w:rPr>
-          <w:rFonts w:ascii="微软雅黑" w:hAnsi="微软雅黑" w:eastAsia="微软雅黑"/>
-          <w:b/>
-          <w:color w:val="1E3A5F"/>
-          <w:sz w:val="36"/>
-        </w:rPr>
-        <w:t>四、交付</w:t>
-      </w:r>
-    </w:p>
-    <w:p>
-      <w:pPr>
-        <w:spacing w:after="0" w:before="0"/>
-        <w:ind w:left="320"/>
-      </w:pPr>
-      <w:r>
-        <w:rPr>
-          <w:rFonts w:ascii="Consolas" w:hAnsi="Consolas" w:eastAsia="微软雅黑"/>
-          <w:color w:val="1F2937"/>
-          <w:sz w:val="18"/>
-        </w:rPr>
-        <w:t>板端验证通过</w:t>
-      </w:r>
-    </w:p>
-    <w:p>
-      <w:pPr>
-        <w:spacing w:after="0" w:before="0"/>
-        <w:ind w:left="320"/>
-      </w:pPr>
-      <w:r>
-        <w:rPr>
-          <w:rFonts w:ascii="Consolas" w:hAnsi="Consolas" w:eastAsia="微软雅黑"/>
-          <w:color w:val="1F2937"/>
-          <w:sz w:val="18"/>
-        </w:rPr>
-        <w:t xml:space="preserve">  ↓</w:t>
-      </w:r>
-    </w:p>
-    <w:p>
-      <w:pPr>
-        <w:spacing w:after="0" w:before="0"/>
-        <w:ind w:left="320"/>
-      </w:pPr>
-      <w:r>
-        <w:rPr>
-          <w:rFonts w:ascii="Consolas" w:hAnsi="Consolas" w:eastAsia="微软雅黑"/>
-          <w:color w:val="1F2937"/>
-          <w:sz w:val="18"/>
-        </w:rPr>
-        <w:t>生成内部候选 release 包</w:t>
-      </w:r>
-    </w:p>
-    <w:p>
-      <w:pPr>
-        <w:spacing w:after="0" w:before="0"/>
-        <w:ind w:left="320"/>
-      </w:pPr>
-      <w:r>
-        <w:rPr>
-          <w:rFonts w:ascii="Consolas" w:hAnsi="Consolas" w:eastAsia="微软雅黑"/>
-          <w:color w:val="1F2937"/>
-          <w:sz w:val="18"/>
-        </w:rPr>
-        <w:t xml:space="preserve">  ↓</w:t>
-      </w:r>
-    </w:p>
-    <w:p>
-      <w:pPr>
-        <w:spacing w:after="0" w:before="0"/>
-        <w:ind w:left="320"/>
-      </w:pPr>
-      <w:r>
-        <w:rPr>
-          <w:rFonts w:ascii="Consolas" w:hAnsi="Consolas" w:eastAsia="微软雅黑"/>
-          <w:color w:val="1F2937"/>
-          <w:sz w:val="18"/>
-        </w:rPr>
-        <w:t>自动生成 readme.txt / doc / release note</w:t>
-      </w:r>
-    </w:p>
-    <w:p>
-      <w:pPr>
-        <w:spacing w:after="0" w:before="0"/>
-        <w:ind w:left="320"/>
-      </w:pPr>
-      <w:r>
-        <w:rPr>
-          <w:rFonts w:ascii="Consolas" w:hAnsi="Consolas" w:eastAsia="微软雅黑"/>
-          <w:color w:val="1F2937"/>
-          <w:sz w:val="18"/>
-        </w:rPr>
-        <w:t xml:space="preserve">  ↓</w:t>
-      </w:r>
-    </w:p>
-    <w:p>
-      <w:pPr>
-        <w:spacing w:after="0" w:before="0"/>
-        <w:ind w:left="320"/>
-      </w:pPr>
-      <w:r>
-        <w:rPr>
-          <w:rFonts w:ascii="Consolas" w:hAnsi="Consolas" w:eastAsia="微软雅黑"/>
-          <w:color w:val="1F2937"/>
-          <w:sz w:val="18"/>
-        </w:rPr>
-        <w:t>准备 Gerrit 提交材料</w:t>
-      </w:r>
-    </w:p>
-    <w:p>
-      <w:pPr>
-        <w:spacing w:after="0" w:before="0"/>
-        <w:ind w:left="320"/>
-      </w:pPr>
-      <w:r>
-        <w:rPr>
-          <w:rFonts w:ascii="Consolas" w:hAnsi="Consolas" w:eastAsia="微软雅黑"/>
-          <w:color w:val="1F2937"/>
-          <w:sz w:val="18"/>
-        </w:rPr>
-        <w:t xml:space="preserve">  ↓</w:t>
-      </w:r>
-    </w:p>
-    <w:p>
-      <w:pPr>
-        <w:spacing w:after="0" w:before="0"/>
-        <w:ind w:left="320"/>
-      </w:pPr>
-      <w:r>
-        <w:rPr>
-          <w:rFonts w:ascii="Consolas" w:hAnsi="Consolas" w:eastAsia="微软雅黑"/>
-          <w:color w:val="1F2937"/>
-          <w:sz w:val="18"/>
-        </w:rPr>
-        <w:t>人工审批</w:t>
-      </w:r>
-    </w:p>
-    <w:p>
-      <w:pPr>
-        <w:spacing w:after="0" w:before="0"/>
-        <w:ind w:left="320"/>
-      </w:pPr>
-      <w:r>
-        <w:rPr>
-          <w:rFonts w:ascii="Consolas" w:hAnsi="Consolas" w:eastAsia="微软雅黑"/>
-          <w:color w:val="1F2937"/>
-          <w:sz w:val="18"/>
-        </w:rPr>
-        <w:t xml:space="preserve">  ↓</w:t>
-      </w:r>
-    </w:p>
-    <w:p>
-      <w:pPr>
-        <w:spacing w:after="0" w:before="0"/>
-        <w:ind w:left="320"/>
-      </w:pPr>
-      <w:r>
-        <w:rPr>
-          <w:rFonts w:ascii="Consolas" w:hAnsi="Consolas" w:eastAsia="微软雅黑"/>
-          <w:color w:val="1F2937"/>
-          <w:sz w:val="18"/>
-        </w:rPr>
-        <w:t>提交/合入 Gerrit（若涉及代码）</w:t>
-      </w:r>
-    </w:p>
-    <w:p>
-      <w:pPr>
-        <w:spacing w:after="0" w:before="0"/>
-        <w:ind w:left="320"/>
-      </w:pPr>
-      <w:r>
-        <w:rPr>
-          <w:rFonts w:ascii="Consolas" w:hAnsi="Consolas" w:eastAsia="微软雅黑"/>
-          <w:color w:val="1F2937"/>
-          <w:sz w:val="18"/>
-        </w:rPr>
-        <w:t xml:space="preserve">  ↓</w:t>
-      </w:r>
-    </w:p>
-    <w:p>
-      <w:pPr>
-        <w:spacing w:after="0" w:before="0"/>
-        <w:ind w:left="320"/>
-      </w:pPr>
-      <w:r>
-        <w:rPr>
-          <w:rFonts w:ascii="Consolas" w:hAnsi="Consolas" w:eastAsia="微软雅黑"/>
-          <w:color w:val="1F2937"/>
-          <w:sz w:val="18"/>
-        </w:rPr>
-        <w:t>归档版本与测试报告</w:t>
-      </w:r>
-    </w:p>
-    <w:p>
-      <w:pPr>
-        <w:spacing w:after="0" w:before="0"/>
-        <w:ind w:left="320"/>
-      </w:pPr>
-      <w:r>
-        <w:rPr>
-          <w:rFonts w:ascii="Consolas" w:hAnsi="Consolas" w:eastAsia="微软雅黑"/>
-          <w:color w:val="1F2937"/>
-          <w:sz w:val="18"/>
-        </w:rPr>
-        <w:t xml:space="preserve">  ↓</w:t>
-      </w:r>
-    </w:p>
-    <w:p>
-      <w:pPr>
-        <w:spacing w:after="0" w:before="0"/>
-        <w:ind w:left="320"/>
-      </w:pPr>
-      <w:r>
-        <w:rPr>
-          <w:rFonts w:ascii="Consolas" w:hAnsi="Consolas" w:eastAsia="微软雅黑"/>
-          <w:color w:val="1F2937"/>
-          <w:sz w:val="18"/>
-        </w:rPr>
-        <w:t>进入客户同步流程</w:t>
-      </w:r>
-    </w:p>
-    <w:p>
-      <w:pPr>
-        <w:spacing w:after="0" w:before="0"/>
-        <w:ind w:left="320"/>
-      </w:pPr>
-      <w:r>
-        <w:rPr>
-          <w:rFonts w:ascii="Consolas" w:hAnsi="Consolas" w:eastAsia="微软雅黑"/>
-          <w:color w:val="1F2937"/>
-          <w:sz w:val="18"/>
-        </w:rPr>
-        <w:t xml:space="preserve">  ↓</w:t>
-      </w:r>
-    </w:p>
-    <w:p>
-      <w:pPr>
-        <w:spacing w:after="0" w:before="0"/>
-        <w:ind w:left="320"/>
-      </w:pPr>
-      <w:r>
-        <w:rPr>
-          <w:rFonts w:ascii="Consolas" w:hAnsi="Consolas" w:eastAsia="微软雅黑"/>
-          <w:color w:val="1F2937"/>
-          <w:sz w:val="18"/>
-        </w:rPr>
-        <w:t>客户确认解决/未解决 → 回写 case 库</w:t>
-      </w:r>
-    </w:p>
-    <w:p>
-      <w:pPr>
-        <w:pStyle w:val="Heading2"/>
-      </w:pPr>
-      <w:r>
-        <w:rPr>
-          <w:rFonts w:ascii="微软雅黑" w:hAnsi="微软雅黑" w:eastAsia="微软雅黑"/>
-          <w:b/>
-          <w:color w:val="1E40AF"/>
-          <w:sz w:val="30"/>
-        </w:rPr>
-        <w:t>1. 自动准备内容</w:t>
-      </w:r>
-    </w:p>
-    <w:p>
-      <w:pPr>
-        <w:pStyle w:val="ListBullet"/>
-      </w:pPr>
-      <w:r>
-        <w:rPr>
-          <w:rFonts w:ascii="微软雅黑" w:hAnsi="微软雅黑" w:eastAsia="微软雅黑"/>
-          <w:sz w:val="21"/>
-        </w:rPr>
-        <w:t>代码 diff（如有）</w:t>
-      </w:r>
-    </w:p>
-    <w:p>
-      <w:pPr>
-        <w:pStyle w:val="ListBullet"/>
-      </w:pPr>
-      <w:r>
-        <w:rPr>
-          <w:rFonts w:ascii="微软雅黑" w:hAnsi="微软雅黑" w:eastAsia="微软雅黑"/>
-          <w:sz w:val="21"/>
-        </w:rPr>
-        <w:t>内存检查报告</w:t>
-      </w:r>
-    </w:p>
-    <w:p>
-      <w:pPr>
-        <w:pStyle w:val="ListBullet"/>
-      </w:pPr>
-      <w:r>
-        <w:rPr>
-          <w:rFonts w:ascii="微软雅黑" w:hAnsi="微软雅黑" w:eastAsia="微软雅黑"/>
-          <w:sz w:val="21"/>
-        </w:rPr>
-        <w:t>板端测试报告</w:t>
-      </w:r>
-    </w:p>
-    <w:p>
-      <w:pPr>
-        <w:pStyle w:val="ListBullet"/>
-      </w:pPr>
-      <w:r>
-        <w:rPr>
-          <w:rFonts w:ascii="微软雅黑" w:hAnsi="微软雅黑" w:eastAsia="微软雅黑"/>
-          <w:sz w:val="21"/>
-        </w:rPr>
-        <w:t>模型版本信息</w:t>
-      </w:r>
-    </w:p>
-    <w:p>
-      <w:pPr>
-        <w:pStyle w:val="ListBullet"/>
-      </w:pPr>
-      <w:r>
-        <w:rPr>
-          <w:rFonts w:ascii="微软雅黑" w:hAnsi="微软雅黑" w:eastAsia="微软雅黑"/>
-          <w:sz w:val="21"/>
-        </w:rPr>
-        <w:t>readme.txt</w:t>
-      </w:r>
-    </w:p>
-    <w:p>
-      <w:pPr>
-        <w:pStyle w:val="ListBullet"/>
-      </w:pPr>
-      <w:r>
-        <w:rPr>
-          <w:rFonts w:ascii="微软雅黑" w:hAnsi="微软雅黑" w:eastAsia="微软雅黑"/>
-          <w:sz w:val="21"/>
-        </w:rPr>
-        <w:t>doc</w:t>
-      </w:r>
-    </w:p>
-    <w:p>
-      <w:pPr>
-        <w:pStyle w:val="ListBullet"/>
-      </w:pPr>
-      <w:r>
-        <w:rPr>
-          <w:rFonts w:ascii="微软雅黑" w:hAnsi="微软雅黑" w:eastAsia="微软雅黑"/>
-          <w:sz w:val="21"/>
-        </w:rPr>
-        <w:t>release note</w:t>
       </w:r>
     </w:p>
     <w:p>

</xml_diff>